<commit_message>
Update sad lab work
</commit_message>
<xml_diff>
--- a/BIM_Lab_Work/BIM(5th Sem)/Print/python_coverpage.docx
+++ b/BIM_Lab_Work/BIM(5th Sem)/Print/python_coverpage.docx
@@ -381,7 +381,6 @@
           <w:rFonts w:cs="Times New Roman"/>
           <w:sz w:val="28"/>
           <w:szCs w:val="28"/>
-          <w:lang w:val="en-US"/>
         </w:rPr>
       </w:pPr>
       <w:r>
@@ -397,7 +396,6 @@
           <w:rFonts w:cs="Times New Roman"/>
           <w:sz w:val="28"/>
           <w:szCs w:val="28"/>
-          <w:lang w:val="en-US"/>
         </w:rPr>
         <w:t>5</w:t>
       </w:r>
@@ -833,9 +831,6 @@
                           <w:p>
                             <w:pPr>
                               <w:jc w:val="center"/>
-                              <w:rPr>
-                                <w:lang w:val="en-US"/>
-                              </w:rPr>
                             </w:pPr>
                             <w:r>
                               <w:rPr>
@@ -845,34 +840,7 @@
                               <w:t>Date of submission:</w:t>
                             </w:r>
                             <w:r>
-                              <w:t xml:space="preserve"> 202</w:t>
-                            </w:r>
-                            <w:r>
-                              <w:t>6</w:t>
-                            </w:r>
-                            <w:r>
-                              <w:t>/</w:t>
-                            </w:r>
-                            <w:r>
-                              <w:t>0</w:t>
-                            </w:r>
-                            <w:r>
-                              <w:rPr>
-                                <w:lang w:val="en-US"/>
-                              </w:rPr>
-                              <w:t>4</w:t>
-                            </w:r>
-                            <w:r>
-                              <w:t>/</w:t>
-                            </w:r>
-                            <w:r>
-                              <w:t>0</w:t>
-                            </w:r>
-                            <w:r>
-                              <w:rPr>
-                                <w:lang w:val="en-US"/>
-                              </w:rPr>
-                              <w:t>8</w:t>
+                              <w:t xml:space="preserve"> </w:t>
                             </w:r>
                           </w:p>
                         </w:txbxContent>
@@ -901,9 +869,6 @@
                     <w:p>
                       <w:pPr>
                         <w:jc w:val="center"/>
-                        <w:rPr>
-                          <w:lang w:val="en-US"/>
-                        </w:rPr>
                       </w:pPr>
                       <w:r>
                         <w:rPr>
@@ -913,34 +878,7 @@
                         <w:t>Date of submission:</w:t>
                       </w:r>
                       <w:r>
-                        <w:t xml:space="preserve"> 202</w:t>
-                      </w:r>
-                      <w:r>
-                        <w:t>6</w:t>
-                      </w:r>
-                      <w:r>
-                        <w:t>/</w:t>
-                      </w:r>
-                      <w:r>
-                        <w:t>0</w:t>
-                      </w:r>
-                      <w:r>
-                        <w:rPr>
-                          <w:lang w:val="en-US"/>
-                        </w:rPr>
-                        <w:t>4</w:t>
-                      </w:r>
-                      <w:r>
-                        <w:t>/</w:t>
-                      </w:r>
-                      <w:r>
-                        <w:t>0</w:t>
-                      </w:r>
-                      <w:r>
-                        <w:rPr>
-                          <w:lang w:val="en-US"/>
-                        </w:rPr>
-                        <w:t>8</w:t>
+                        <w:t xml:space="preserve"> </w:t>
                       </w:r>
                     </w:p>
                   </w:txbxContent>
@@ -953,12 +891,3081 @@
       </w:r>
     </w:p>
     <w:p/>
-    <w:p>
-      <w:pPr>
-        <w:rPr>
-          <w:lang w:val="en-US"/>
-        </w:rPr>
-      </w:pPr>
+    <w:p/>
+    <w:p>
+      <w:pPr>
+        <w:spacing w:after="160" w:line="278" w:lineRule="auto"/>
+      </w:pPr>
+      <w:r>
+        <w:br w:type="page"/>
+      </w:r>
+    </w:p>
+    <w:p>
+      <w:pPr>
+        <w:spacing w:after="149"/>
+        <w:ind w:right="26"/>
+        <w:jc w:val="center"/>
+        <w:rPr>
+          <w:rFonts w:cs="Times New Roman"/>
+          <w:b/>
+          <w:bCs/>
+          <w:sz w:val="36"/>
+          <w:szCs w:val="36"/>
+        </w:rPr>
+      </w:pPr>
+      <w:r>
+        <w:rPr>
+          <w:rFonts w:cs="Times New Roman"/>
+          <w:b/>
+          <w:bCs/>
+          <w:sz w:val="36"/>
+          <w:szCs w:val="36"/>
+        </w:rPr>
+        <w:lastRenderedPageBreak/>
+        <w:t>National College of Computer Studies</w:t>
+      </w:r>
+    </w:p>
+    <w:p>
+      <w:pPr>
+        <w:spacing w:after="149"/>
+        <w:ind w:right="26"/>
+        <w:jc w:val="center"/>
+        <w:rPr>
+          <w:rFonts w:cs="Times New Roman"/>
+          <w:b/>
+          <w:bCs/>
+          <w:sz w:val="32"/>
+          <w:szCs w:val="32"/>
+        </w:rPr>
+      </w:pPr>
+      <w:proofErr w:type="spellStart"/>
+      <w:r>
+        <w:rPr>
+          <w:rFonts w:cs="Times New Roman"/>
+          <w:b/>
+          <w:bCs/>
+          <w:sz w:val="32"/>
+          <w:szCs w:val="32"/>
+        </w:rPr>
+        <w:t>Paknajol</w:t>
+      </w:r>
+      <w:proofErr w:type="spellEnd"/>
+      <w:r>
+        <w:rPr>
+          <w:rFonts w:cs="Times New Roman"/>
+          <w:b/>
+          <w:bCs/>
+          <w:sz w:val="32"/>
+          <w:szCs w:val="32"/>
+        </w:rPr>
+        <w:t>, Kathmandu</w:t>
+      </w:r>
+    </w:p>
+    <w:p>
+      <w:pPr>
+        <w:spacing w:after="149"/>
+        <w:ind w:right="26"/>
+        <w:jc w:val="center"/>
+        <w:rPr>
+          <w:rFonts w:cs="Times New Roman"/>
+          <w:b/>
+          <w:bCs/>
+          <w:sz w:val="32"/>
+          <w:szCs w:val="32"/>
+        </w:rPr>
+      </w:pPr>
+    </w:p>
+    <w:p>
+      <w:pPr>
+        <w:spacing w:after="149"/>
+        <w:ind w:right="26"/>
+        <w:jc w:val="center"/>
+        <w:rPr>
+          <w:rFonts w:cs="Times New Roman"/>
+        </w:rPr>
+      </w:pPr>
+    </w:p>
+    <w:p>
+      <w:pPr>
+        <w:ind w:right="5034"/>
+        <w:rPr>
+          <w:rFonts w:cs="Times New Roman"/>
+        </w:rPr>
+      </w:pPr>
+    </w:p>
+    <w:p>
+      <w:pPr>
+        <w:spacing w:after="76"/>
+        <w:ind w:left="3914"/>
+        <w:rPr>
+          <w:rFonts w:cs="Times New Roman"/>
+        </w:rPr>
+      </w:pPr>
+      <w:r>
+        <w:rPr>
+          <w:rFonts w:cs="Times New Roman"/>
+          <w:noProof/>
+        </w:rPr>
+        <mc:AlternateContent>
+          <mc:Choice Requires="wpg">
+            <w:drawing>
+              <wp:inline distT="0" distB="0" distL="0" distR="0" wp14:anchorId="5377DFF1" wp14:editId="38D6FDFD">
+                <wp:extent cx="609600" cy="2020570"/>
+                <wp:effectExtent l="0" t="0" r="0" b="0"/>
+                <wp:docPr id="770668446" name="Group 770668446"/>
+                <wp:cNvGraphicFramePr>
+                  <a:graphicFrameLocks xmlns:a="http://schemas.openxmlformats.org/drawingml/2006/main"/>
+                </wp:cNvGraphicFramePr>
+                <a:graphic xmlns:a="http://schemas.openxmlformats.org/drawingml/2006/main">
+                  <a:graphicData uri="http://schemas.microsoft.com/office/word/2010/wordprocessingGroup">
+                    <wpg:wgp>
+                      <wpg:cNvGrpSpPr>
+                        <a:grpSpLocks/>
+                      </wpg:cNvGrpSpPr>
+                      <wpg:grpSpPr bwMode="auto">
+                        <a:xfrm>
+                          <a:off x="0" y="0"/>
+                          <a:ext cx="609600" cy="2020570"/>
+                          <a:chOff x="0" y="0"/>
+                          <a:chExt cx="6096" cy="20208"/>
+                        </a:xfrm>
+                      </wpg:grpSpPr>
+                      <wps:wsp>
+                        <wps:cNvPr id="2064254474" name="Shape 40"/>
+                        <wps:cNvSpPr>
+                          <a:spLocks/>
+                        </wps:cNvSpPr>
+                        <wps:spPr bwMode="auto">
+                          <a:xfrm>
+                            <a:off x="0" y="3657"/>
+                            <a:ext cx="0" cy="13609"/>
+                          </a:xfrm>
+                          <a:custGeom>
+                            <a:avLst/>
+                            <a:gdLst>
+                              <a:gd name="T0" fmla="*/ 0 h 1360932"/>
+                              <a:gd name="T1" fmla="*/ 13609 h 1360932"/>
+                              <a:gd name="T2" fmla="*/ 0 60000 65536"/>
+                              <a:gd name="T3" fmla="*/ 0 60000 65536"/>
+                              <a:gd name="T4" fmla="*/ 0 h 1360932"/>
+                              <a:gd name="T5" fmla="*/ 1360932 h 1360932"/>
+                            </a:gdLst>
+                            <a:ahLst/>
+                            <a:cxnLst>
+                              <a:cxn ang="T2">
+                                <a:pos x="0" y="T0"/>
+                              </a:cxn>
+                              <a:cxn ang="T3">
+                                <a:pos x="0" y="T1"/>
+                              </a:cxn>
+                            </a:cxnLst>
+                            <a:rect l="0" t="T4" r="0" b="T5"/>
+                            <a:pathLst>
+                              <a:path h="1360932">
+                                <a:moveTo>
+                                  <a:pt x="0" y="0"/>
+                                </a:moveTo>
+                                <a:lnTo>
+                                  <a:pt x="0" y="1360932"/>
+                                </a:lnTo>
+                              </a:path>
+                            </a:pathLst>
+                          </a:custGeom>
+                          <a:noFill/>
+                          <a:ln w="11939">
+                            <a:solidFill>
+                              <a:srgbClr val="000000"/>
+                            </a:solidFill>
+                            <a:miter lim="101601"/>
+                            <a:headEnd/>
+                            <a:tailEnd/>
+                          </a:ln>
+                          <a:extLst>
+                            <a:ext uri="{909E8E84-426E-40DD-AFC4-6F175D3DCCD1}">
+                              <a14:hiddenFill xmlns:a14="http://schemas.microsoft.com/office/drawing/2010/main">
+                                <a:solidFill>
+                                  <a:srgbClr val="FFFFFF"/>
+                                </a:solidFill>
+                              </a14:hiddenFill>
+                            </a:ext>
+                          </a:extLst>
+                        </wps:spPr>
+                        <wps:bodyPr rot="0" vert="horz" wrap="square" lIns="91440" tIns="45720" rIns="91440" bIns="45720" anchor="t" anchorCtr="0" upright="1">
+                          <a:noAutofit/>
+                        </wps:bodyPr>
+                      </wps:wsp>
+                      <wps:wsp>
+                        <wps:cNvPr id="515896103" name="Shape 41"/>
+                        <wps:cNvSpPr>
+                          <a:spLocks/>
+                        </wps:cNvSpPr>
+                        <wps:spPr bwMode="auto">
+                          <a:xfrm>
+                            <a:off x="2941" y="0"/>
+                            <a:ext cx="152" cy="20208"/>
+                          </a:xfrm>
+                          <a:custGeom>
+                            <a:avLst/>
+                            <a:gdLst>
+                              <a:gd name="T0" fmla="*/ 152 w 15240"/>
+                              <a:gd name="T1" fmla="*/ 0 h 2020824"/>
+                              <a:gd name="T2" fmla="*/ 0 w 15240"/>
+                              <a:gd name="T3" fmla="*/ 20208 h 2020824"/>
+                              <a:gd name="T4" fmla="*/ 0 60000 65536"/>
+                              <a:gd name="T5" fmla="*/ 0 60000 65536"/>
+                              <a:gd name="T6" fmla="*/ 0 w 15240"/>
+                              <a:gd name="T7" fmla="*/ 0 h 2020824"/>
+                              <a:gd name="T8" fmla="*/ 15240 w 15240"/>
+                              <a:gd name="T9" fmla="*/ 2020824 h 2020824"/>
+                            </a:gdLst>
+                            <a:ahLst/>
+                            <a:cxnLst>
+                              <a:cxn ang="T4">
+                                <a:pos x="T0" y="T1"/>
+                              </a:cxn>
+                              <a:cxn ang="T5">
+                                <a:pos x="T2" y="T3"/>
+                              </a:cxn>
+                            </a:cxnLst>
+                            <a:rect l="T6" t="T7" r="T8" b="T9"/>
+                            <a:pathLst>
+                              <a:path w="15240" h="2020824">
+                                <a:moveTo>
+                                  <a:pt x="15240" y="0"/>
+                                </a:moveTo>
+                                <a:lnTo>
+                                  <a:pt x="0" y="2020824"/>
+                                </a:lnTo>
+                              </a:path>
+                            </a:pathLst>
+                          </a:custGeom>
+                          <a:noFill/>
+                          <a:ln w="11939">
+                            <a:solidFill>
+                              <a:srgbClr val="000000"/>
+                            </a:solidFill>
+                            <a:miter lim="101601"/>
+                            <a:headEnd/>
+                            <a:tailEnd/>
+                          </a:ln>
+                          <a:extLst>
+                            <a:ext uri="{909E8E84-426E-40DD-AFC4-6F175D3DCCD1}">
+                              <a14:hiddenFill xmlns:a14="http://schemas.microsoft.com/office/drawing/2010/main">
+                                <a:solidFill>
+                                  <a:srgbClr val="FFFFFF"/>
+                                </a:solidFill>
+                              </a14:hiddenFill>
+                            </a:ext>
+                          </a:extLst>
+                        </wps:spPr>
+                        <wps:bodyPr rot="0" vert="horz" wrap="square" lIns="91440" tIns="45720" rIns="91440" bIns="45720" anchor="t" anchorCtr="0" upright="1">
+                          <a:noAutofit/>
+                        </wps:bodyPr>
+                      </wps:wsp>
+                      <wps:wsp>
+                        <wps:cNvPr id="1253757459" name="Shape 42"/>
+                        <wps:cNvSpPr>
+                          <a:spLocks/>
+                        </wps:cNvSpPr>
+                        <wps:spPr bwMode="auto">
+                          <a:xfrm>
+                            <a:off x="6096" y="3642"/>
+                            <a:ext cx="0" cy="13609"/>
+                          </a:xfrm>
+                          <a:custGeom>
+                            <a:avLst/>
+                            <a:gdLst>
+                              <a:gd name="T0" fmla="*/ 0 h 1360932"/>
+                              <a:gd name="T1" fmla="*/ 13609 h 1360932"/>
+                              <a:gd name="T2" fmla="*/ 0 60000 65536"/>
+                              <a:gd name="T3" fmla="*/ 0 60000 65536"/>
+                              <a:gd name="T4" fmla="*/ 0 h 1360932"/>
+                              <a:gd name="T5" fmla="*/ 1360932 h 1360932"/>
+                            </a:gdLst>
+                            <a:ahLst/>
+                            <a:cxnLst>
+                              <a:cxn ang="T2">
+                                <a:pos x="0" y="T0"/>
+                              </a:cxn>
+                              <a:cxn ang="T3">
+                                <a:pos x="0" y="T1"/>
+                              </a:cxn>
+                            </a:cxnLst>
+                            <a:rect l="0" t="T4" r="0" b="T5"/>
+                            <a:pathLst>
+                              <a:path h="1360932">
+                                <a:moveTo>
+                                  <a:pt x="0" y="0"/>
+                                </a:moveTo>
+                                <a:lnTo>
+                                  <a:pt x="0" y="1360932"/>
+                                </a:lnTo>
+                              </a:path>
+                            </a:pathLst>
+                          </a:custGeom>
+                          <a:noFill/>
+                          <a:ln w="11939">
+                            <a:solidFill>
+                              <a:srgbClr val="000000"/>
+                            </a:solidFill>
+                            <a:miter lim="101601"/>
+                            <a:headEnd/>
+                            <a:tailEnd/>
+                          </a:ln>
+                          <a:extLst>
+                            <a:ext uri="{909E8E84-426E-40DD-AFC4-6F175D3DCCD1}">
+                              <a14:hiddenFill xmlns:a14="http://schemas.microsoft.com/office/drawing/2010/main">
+                                <a:solidFill>
+                                  <a:srgbClr val="FFFFFF"/>
+                                </a:solidFill>
+                              </a14:hiddenFill>
+                            </a:ext>
+                          </a:extLst>
+                        </wps:spPr>
+                        <wps:bodyPr rot="0" vert="horz" wrap="square" lIns="91440" tIns="45720" rIns="91440" bIns="45720" anchor="t" anchorCtr="0" upright="1">
+                          <a:noAutofit/>
+                        </wps:bodyPr>
+                      </wps:wsp>
+                    </wpg:wgp>
+                  </a:graphicData>
+                </a:graphic>
+              </wp:inline>
+            </w:drawing>
+          </mc:Choice>
+          <mc:Fallback>
+            <w:pict>
+              <v:group w14:anchorId="6045C6F1" id="Group 770668446" o:spid="_x0000_s1026" style="width:48pt;height:159.1pt;mso-position-horizontal-relative:char;mso-position-vertical-relative:line" coordsize="6096,20208" o:gfxdata="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">
+                <v:shape id="Shape 40" o:spid="_x0000_s1027" style="position:absolute;top:3657;width:0;height:13609;visibility:visible;mso-wrap-style:square;v-text-anchor:top" coordsize="0,1360932" o:gfxdata="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" path="m,l,1360932e" filled="f" strokeweight=".33164mm">
+                  <v:stroke miterlimit="66585f" joinstyle="miter"/>
+                  <v:path arrowok="t" o:connecttype="custom" o:connectlocs="0,0;0,136" o:connectangles="0,0" textboxrect="0,0,0,1360932"/>
+                </v:shape>
+                <v:shape id="Shape 41" o:spid="_x0000_s1028" style="position:absolute;left:2941;width:152;height:20208;visibility:visible;mso-wrap-style:square;v-text-anchor:top" coordsize="15240,2020824" o:gfxdata="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" path="m15240,l,2020824e" filled="f" strokeweight=".33164mm">
+                  <v:stroke miterlimit="66585f" joinstyle="miter"/>
+                  <v:path arrowok="t" o:connecttype="custom" o:connectlocs="2,0;0,202" o:connectangles="0,0" textboxrect="0,0,15240,2020824"/>
+                </v:shape>
+                <v:shape id="Shape 42" o:spid="_x0000_s1029" style="position:absolute;left:6096;top:3642;width:0;height:13609;visibility:visible;mso-wrap-style:square;v-text-anchor:top" coordsize="0,1360932" o:gfxdata="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" path="m,l,1360932e" filled="f" strokeweight=".33164mm">
+                  <v:stroke miterlimit="66585f" joinstyle="miter"/>
+                  <v:path arrowok="t" o:connecttype="custom" o:connectlocs="0,0;0,136" o:connectangles="0,0" textboxrect="0,0,0,1360932"/>
+                </v:shape>
+                <w10:anchorlock/>
+              </v:group>
+            </w:pict>
+          </mc:Fallback>
+        </mc:AlternateContent>
+      </w:r>
+    </w:p>
+    <w:p>
+      <w:pPr>
+        <w:spacing w:after="76"/>
+        <w:ind w:left="3914"/>
+        <w:rPr>
+          <w:rFonts w:cs="Times New Roman"/>
+        </w:rPr>
+      </w:pPr>
+    </w:p>
+    <w:p>
+      <w:pPr>
+        <w:spacing w:after="151"/>
+        <w:ind w:right="14"/>
+        <w:jc w:val="center"/>
+        <w:rPr>
+          <w:rFonts w:cs="Times New Roman"/>
+        </w:rPr>
+      </w:pPr>
+    </w:p>
+    <w:p>
+      <w:pPr>
+        <w:spacing w:after="151"/>
+        <w:ind w:right="14"/>
+        <w:jc w:val="center"/>
+        <w:rPr>
+          <w:rFonts w:cs="Times New Roman"/>
+        </w:rPr>
+      </w:pPr>
+    </w:p>
+    <w:p>
+      <w:pPr>
+        <w:spacing w:after="146"/>
+        <w:ind w:left="10" w:right="72" w:hanging="10"/>
+        <w:jc w:val="center"/>
+        <w:rPr>
+          <w:rFonts w:cs="Times New Roman"/>
+          <w:sz w:val="28"/>
+          <w:szCs w:val="28"/>
+        </w:rPr>
+      </w:pPr>
+      <w:r>
+        <w:rPr>
+          <w:rFonts w:cs="Times New Roman"/>
+          <w:sz w:val="28"/>
+          <w:szCs w:val="28"/>
+        </w:rPr>
+        <w:t xml:space="preserve">Lab Report No. </w:t>
+      </w:r>
+      <w:r>
+        <w:rPr>
+          <w:rFonts w:cs="Times New Roman"/>
+          <w:sz w:val="28"/>
+          <w:szCs w:val="28"/>
+        </w:rPr>
+        <w:t>6</w:t>
+      </w:r>
+    </w:p>
+    <w:p>
+      <w:pPr>
+        <w:spacing w:after="146"/>
+        <w:ind w:left="10" w:right="72" w:hanging="10"/>
+        <w:jc w:val="center"/>
+        <w:rPr>
+          <w:rFonts w:cs="Times New Roman"/>
+          <w:b/>
+          <w:bCs/>
+          <w:sz w:val="28"/>
+          <w:szCs w:val="28"/>
+        </w:rPr>
+      </w:pPr>
+      <w:r>
+        <w:rPr>
+          <w:rFonts w:cs="Times New Roman"/>
+          <w:b/>
+          <w:bCs/>
+          <w:sz w:val="28"/>
+          <w:szCs w:val="28"/>
+        </w:rPr>
+        <w:t>Programming with Python</w:t>
+      </w:r>
+    </w:p>
+    <w:p>
+      <w:pPr>
+        <w:spacing w:after="146"/>
+        <w:ind w:left="10" w:right="72" w:hanging="10"/>
+        <w:jc w:val="center"/>
+        <w:rPr>
+          <w:rFonts w:cs="Times New Roman"/>
+          <w:b/>
+          <w:bCs/>
+          <w:sz w:val="28"/>
+          <w:szCs w:val="28"/>
+        </w:rPr>
+      </w:pPr>
+    </w:p>
+    <w:p>
+      <w:pPr>
+        <w:spacing w:after="149"/>
+        <w:rPr>
+          <w:rFonts w:cs="Times New Roman"/>
+        </w:rPr>
+      </w:pPr>
+    </w:p>
+    <w:p>
+      <w:pPr>
+        <w:spacing w:after="139"/>
+        <w:ind w:left="-5" w:hanging="10"/>
+        <w:rPr>
+          <w:rFonts w:cs="Times New Roman"/>
+          <w:sz w:val="28"/>
+          <w:szCs w:val="28"/>
+        </w:rPr>
+      </w:pPr>
+      <w:r>
+        <w:rPr>
+          <w:rFonts w:cs="Times New Roman"/>
+          <w:b/>
+          <w:bCs/>
+          <w:sz w:val="28"/>
+          <w:szCs w:val="28"/>
+        </w:rPr>
+        <w:t>Submitted by</w:t>
+      </w:r>
+      <w:r>
+        <w:rPr>
+          <w:rFonts w:cs="Times New Roman"/>
+          <w:sz w:val="28"/>
+          <w:szCs w:val="28"/>
+        </w:rPr>
+        <w:t xml:space="preserve">: </w:t>
+      </w:r>
+      <w:r>
+        <w:rPr>
+          <w:rFonts w:cs="Times New Roman"/>
+          <w:sz w:val="28"/>
+          <w:szCs w:val="28"/>
+        </w:rPr>
+        <w:tab/>
+      </w:r>
+      <w:r>
+        <w:rPr>
+          <w:rFonts w:cs="Times New Roman"/>
+          <w:sz w:val="28"/>
+          <w:szCs w:val="28"/>
+        </w:rPr>
+        <w:tab/>
+      </w:r>
+      <w:r>
+        <w:rPr>
+          <w:rFonts w:cs="Times New Roman"/>
+          <w:sz w:val="28"/>
+          <w:szCs w:val="28"/>
+        </w:rPr>
+        <w:tab/>
+      </w:r>
+      <w:r>
+        <w:rPr>
+          <w:rFonts w:cs="Times New Roman"/>
+          <w:sz w:val="28"/>
+          <w:szCs w:val="28"/>
+        </w:rPr>
+        <w:tab/>
+      </w:r>
+      <w:r>
+        <w:rPr>
+          <w:rFonts w:cs="Times New Roman"/>
+          <w:sz w:val="28"/>
+          <w:szCs w:val="28"/>
+        </w:rPr>
+        <w:tab/>
+      </w:r>
+      <w:r>
+        <w:rPr>
+          <w:rFonts w:cs="Times New Roman"/>
+          <w:sz w:val="28"/>
+          <w:szCs w:val="28"/>
+        </w:rPr>
+        <w:tab/>
+      </w:r>
+      <w:r>
+        <w:rPr>
+          <w:rFonts w:cs="Times New Roman"/>
+          <w:b/>
+          <w:bCs/>
+          <w:sz w:val="28"/>
+          <w:szCs w:val="28"/>
+        </w:rPr>
+        <w:t xml:space="preserve">   Submitted to:</w:t>
+      </w:r>
+    </w:p>
+    <w:p>
+      <w:pPr>
+        <w:spacing w:after="139"/>
+        <w:ind w:left="-5" w:hanging="10"/>
+        <w:rPr>
+          <w:rFonts w:cs="Times New Roman"/>
+          <w:sz w:val="28"/>
+          <w:szCs w:val="28"/>
+        </w:rPr>
+      </w:pPr>
+      <w:r>
+        <w:rPr>
+          <w:rFonts w:cs="Times New Roman"/>
+          <w:sz w:val="28"/>
+          <w:szCs w:val="28"/>
+        </w:rPr>
+        <w:t xml:space="preserve">Name: Siddhartha Shakya                              </w:t>
+      </w:r>
+      <w:r>
+        <w:rPr>
+          <w:rFonts w:cs="Times New Roman"/>
+          <w:sz w:val="28"/>
+          <w:szCs w:val="28"/>
+        </w:rPr>
+        <w:tab/>
+      </w:r>
+      <w:r>
+        <w:rPr>
+          <w:rFonts w:cs="Times New Roman"/>
+          <w:sz w:val="28"/>
+          <w:szCs w:val="28"/>
+        </w:rPr>
+        <w:tab/>
+        <w:t xml:space="preserve">  </w:t>
+      </w:r>
+      <w:r>
+        <w:rPr>
+          <w:rFonts w:cs="Times New Roman"/>
+          <w:sz w:val="28"/>
+          <w:szCs w:val="28"/>
+        </w:rPr>
+        <w:t xml:space="preserve"> Sumit </w:t>
+      </w:r>
+      <w:proofErr w:type="spellStart"/>
+      <w:r>
+        <w:rPr>
+          <w:rFonts w:cs="Times New Roman"/>
+          <w:sz w:val="28"/>
+          <w:szCs w:val="28"/>
+        </w:rPr>
+        <w:t>Ghising</w:t>
+      </w:r>
+      <w:proofErr w:type="spellEnd"/>
+      <w:r>
+        <w:rPr>
+          <w:rFonts w:cs="Times New Roman"/>
+          <w:sz w:val="28"/>
+          <w:szCs w:val="28"/>
+        </w:rPr>
+        <w:tab/>
+        <w:t xml:space="preserve">  </w:t>
+      </w:r>
+    </w:p>
+    <w:p>
+      <w:pPr>
+        <w:spacing w:after="187"/>
+        <w:ind w:left="-5" w:hanging="10"/>
+        <w:rPr>
+          <w:rFonts w:cs="Times New Roman"/>
+          <w:sz w:val="28"/>
+          <w:szCs w:val="28"/>
+        </w:rPr>
+      </w:pPr>
+      <w:r>
+        <w:rPr>
+          <w:rFonts w:cs="Times New Roman"/>
+          <w:sz w:val="28"/>
+          <w:szCs w:val="28"/>
+        </w:rPr>
+        <w:t>Program: BIM</w:t>
+      </w:r>
+      <w:r>
+        <w:rPr>
+          <w:rFonts w:cs="Times New Roman"/>
+          <w:sz w:val="28"/>
+          <w:szCs w:val="28"/>
+        </w:rPr>
+        <w:tab/>
+        <w:t xml:space="preserve">            </w:t>
+      </w:r>
+      <w:r>
+        <w:rPr>
+          <w:rFonts w:cs="Times New Roman"/>
+          <w:sz w:val="28"/>
+          <w:szCs w:val="28"/>
+        </w:rPr>
+        <w:tab/>
+      </w:r>
+      <w:r>
+        <w:rPr>
+          <w:rFonts w:cs="Times New Roman"/>
+          <w:sz w:val="28"/>
+          <w:szCs w:val="28"/>
+        </w:rPr>
+        <w:tab/>
+      </w:r>
+      <w:r>
+        <w:rPr>
+          <w:rFonts w:cs="Times New Roman"/>
+          <w:sz w:val="28"/>
+          <w:szCs w:val="28"/>
+        </w:rPr>
+        <w:tab/>
+      </w:r>
+      <w:r>
+        <w:rPr>
+          <w:rFonts w:cs="Times New Roman"/>
+          <w:sz w:val="28"/>
+          <w:szCs w:val="28"/>
+        </w:rPr>
+        <w:tab/>
+        <w:t xml:space="preserve">   </w:t>
+      </w:r>
+    </w:p>
+    <w:p>
+      <w:pPr>
+        <w:spacing w:after="187"/>
+        <w:ind w:left="-5" w:hanging="10"/>
+        <w:rPr>
+          <w:rFonts w:cs="Times New Roman"/>
+          <w:sz w:val="28"/>
+          <w:szCs w:val="28"/>
+        </w:rPr>
+      </w:pPr>
+      <w:r>
+        <w:rPr>
+          <w:rFonts w:cs="Times New Roman"/>
+          <w:sz w:val="28"/>
+          <w:szCs w:val="28"/>
+        </w:rPr>
+        <w:t xml:space="preserve">Roll no: </w:t>
+      </w:r>
+      <w:r>
+        <w:rPr>
+          <w:rFonts w:cs="Times New Roman"/>
+          <w:sz w:val="28"/>
+          <w:szCs w:val="28"/>
+        </w:rPr>
+        <w:t>18</w:t>
+      </w:r>
+      <w:r>
+        <w:rPr>
+          <w:rFonts w:cs="Times New Roman"/>
+          <w:sz w:val="28"/>
+          <w:szCs w:val="28"/>
+        </w:rPr>
+        <w:tab/>
+      </w:r>
+      <w:r>
+        <w:rPr>
+          <w:rFonts w:cs="Times New Roman"/>
+          <w:sz w:val="28"/>
+          <w:szCs w:val="28"/>
+        </w:rPr>
+        <w:tab/>
+      </w:r>
+      <w:r>
+        <w:rPr>
+          <w:rFonts w:cs="Times New Roman"/>
+          <w:sz w:val="28"/>
+          <w:szCs w:val="28"/>
+        </w:rPr>
+        <w:tab/>
+      </w:r>
+      <w:r>
+        <w:rPr>
+          <w:rFonts w:cs="Times New Roman"/>
+          <w:sz w:val="28"/>
+          <w:szCs w:val="28"/>
+        </w:rPr>
+        <w:tab/>
+        <w:t xml:space="preserve">             </w:t>
+      </w:r>
+    </w:p>
+    <w:p>
+      <w:pPr>
+        <w:tabs>
+          <w:tab w:val="left" w:pos="6348"/>
+        </w:tabs>
+        <w:spacing w:after="171"/>
+        <w:ind w:left="-5" w:hanging="10"/>
+        <w:rPr>
+          <w:rFonts w:cs="Times New Roman"/>
+          <w:sz w:val="28"/>
+          <w:szCs w:val="28"/>
+        </w:rPr>
+      </w:pPr>
+      <w:r>
+        <w:rPr>
+          <w:rFonts w:cs="Times New Roman"/>
+          <w:sz w:val="28"/>
+          <w:szCs w:val="28"/>
+        </w:rPr>
+        <w:t xml:space="preserve">Section: B </w:t>
+      </w:r>
+      <w:r>
+        <w:rPr>
+          <w:rFonts w:cs="Times New Roman"/>
+          <w:sz w:val="28"/>
+          <w:szCs w:val="28"/>
+        </w:rPr>
+        <w:tab/>
+      </w:r>
+    </w:p>
+    <w:p>
+      <w:pPr>
+        <w:tabs>
+          <w:tab w:val="center" w:pos="2707"/>
+          <w:tab w:val="center" w:pos="3384"/>
+          <w:tab w:val="center" w:pos="4061"/>
+        </w:tabs>
+        <w:spacing w:after="139"/>
+        <w:ind w:left="-15"/>
+        <w:rPr>
+          <w:rFonts w:cs="Times New Roman"/>
+          <w:sz w:val="28"/>
+          <w:szCs w:val="28"/>
+        </w:rPr>
+      </w:pPr>
+      <w:r>
+        <w:rPr>
+          <w:rFonts w:cs="Times New Roman"/>
+          <w:sz w:val="28"/>
+          <w:szCs w:val="28"/>
+        </w:rPr>
+        <w:tab/>
+      </w:r>
+      <w:r>
+        <w:rPr>
+          <w:rFonts w:cs="Times New Roman"/>
+          <w:sz w:val="28"/>
+          <w:szCs w:val="28"/>
+        </w:rPr>
+        <w:tab/>
+      </w:r>
+      <w:r>
+        <w:rPr>
+          <w:rFonts w:cs="Times New Roman"/>
+          <w:sz w:val="28"/>
+          <w:szCs w:val="28"/>
+        </w:rPr>
+        <w:tab/>
+      </w:r>
+    </w:p>
+    <w:p>
+      <w:pPr>
+        <w:spacing w:line="259" w:lineRule="auto"/>
+        <w:rPr>
+          <w:sz w:val="28"/>
+          <w:szCs w:val="28"/>
+        </w:rPr>
+      </w:pPr>
+      <w:r>
+        <w:rPr>
+          <w:noProof/>
+          <w:sz w:val="28"/>
+          <w:szCs w:val="28"/>
+        </w:rPr>
+        <mc:AlternateContent>
+          <mc:Choice Requires="wps">
+            <w:drawing>
+              <wp:anchor distT="0" distB="0" distL="114300" distR="114300" simplePos="0" relativeHeight="251663360" behindDoc="0" locked="0" layoutInCell="1" allowOverlap="1" wp14:anchorId="2ADA99CB" wp14:editId="1F4AD425">
+                <wp:simplePos x="0" y="0"/>
+                <wp:positionH relativeFrom="margin">
+                  <wp:posOffset>1677907</wp:posOffset>
+                </wp:positionH>
+                <wp:positionV relativeFrom="paragraph">
+                  <wp:posOffset>228653</wp:posOffset>
+                </wp:positionV>
+                <wp:extent cx="2231756" cy="410705"/>
+                <wp:effectExtent l="0" t="0" r="3810" b="0"/>
+                <wp:wrapNone/>
+                <wp:docPr id="1485619469" name="Text Box 1485619469"/>
+                <wp:cNvGraphicFramePr/>
+                <a:graphic xmlns:a="http://schemas.openxmlformats.org/drawingml/2006/main">
+                  <a:graphicData uri="http://schemas.microsoft.com/office/word/2010/wordprocessingShape">
+                    <wps:wsp>
+                      <wps:cNvSpPr txBox="1"/>
+                      <wps:spPr>
+                        <a:xfrm>
+                          <a:off x="0" y="0"/>
+                          <a:ext cx="2231756" cy="410705"/>
+                        </a:xfrm>
+                        <a:prstGeom prst="rect">
+                          <a:avLst/>
+                        </a:prstGeom>
+                        <a:solidFill>
+                          <a:schemeClr val="lt1"/>
+                        </a:solidFill>
+                        <a:ln w="6350">
+                          <a:noFill/>
+                        </a:ln>
+                      </wps:spPr>
+                      <wps:txbx>
+                        <w:txbxContent>
+                          <w:p>
+                            <w:pPr>
+                              <w:jc w:val="center"/>
+                            </w:pPr>
+                            <w:r>
+                              <w:rPr>
+                                <w:b/>
+                                <w:bCs/>
+                              </w:rPr>
+                              <w:t>Date of submission:</w:t>
+                            </w:r>
+                            <w:r>
+                              <w:t xml:space="preserve"> </w:t>
+                            </w:r>
+                          </w:p>
+                        </w:txbxContent>
+                      </wps:txbx>
+                      <wps:bodyPr rot="0" spcFirstLastPara="0" vertOverflow="overflow" horzOverflow="overflow" vert="horz" wrap="square" lIns="91440" tIns="45720" rIns="91440" bIns="45720" numCol="1" spcCol="0" rtlCol="0" fromWordArt="0" anchor="t" anchorCtr="0" forceAA="0" compatLnSpc="1">
+                        <a:prstTxWarp prst="textNoShape">
+                          <a:avLst/>
+                        </a:prstTxWarp>
+                        <a:noAutofit/>
+                      </wps:bodyPr>
+                    </wps:wsp>
+                  </a:graphicData>
+                </a:graphic>
+              </wp:anchor>
+            </w:drawing>
+          </mc:Choice>
+          <mc:Fallback>
+            <w:pict>
+              <v:shape w14:anchorId="2ADA99CB" id="Text Box 1485619469" o:spid="_x0000_s1027" type="#_x0000_t202" style="position:absolute;margin-left:132.1pt;margin-top:18pt;width:175.75pt;height:32.35pt;z-index:251663360;visibility:visible;mso-wrap-style:square;mso-wrap-distance-left:9pt;mso-wrap-distance-top:0;mso-wrap-distance-right:9pt;mso-wrap-distance-bottom:0;mso-position-horizontal:absolute;mso-position-horizontal-relative:margin;mso-position-vertical:absolute;mso-position-vertical-relative:text;v-text-anchor:top" o:gfxdata="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" fillcolor="white [3201]" stroked="f" strokeweight=".5pt">
+                <v:textbox>
+                  <w:txbxContent>
+                    <w:p>
+                      <w:pPr>
+                        <w:jc w:val="center"/>
+                      </w:pPr>
+                      <w:r>
+                        <w:rPr>
+                          <w:b/>
+                          <w:bCs/>
+                        </w:rPr>
+                        <w:t>Date of submission:</w:t>
+                      </w:r>
+                      <w:r>
+                        <w:t xml:space="preserve"> </w:t>
+                      </w:r>
+                    </w:p>
+                  </w:txbxContent>
+                </v:textbox>
+                <w10:wrap anchorx="margin"/>
+              </v:shape>
+            </w:pict>
+          </mc:Fallback>
+        </mc:AlternateContent>
+      </w:r>
+    </w:p>
+    <w:p/>
+    <w:p/>
+    <w:p>
+      <w:pPr>
+        <w:spacing w:after="149"/>
+        <w:ind w:right="26"/>
+        <w:jc w:val="center"/>
+        <w:rPr>
+          <w:rFonts w:cs="Times New Roman"/>
+          <w:b/>
+          <w:bCs/>
+          <w:sz w:val="36"/>
+          <w:szCs w:val="36"/>
+        </w:rPr>
+      </w:pPr>
+      <w:r>
+        <w:br w:type="page"/>
+      </w:r>
+      <w:r>
+        <w:rPr>
+          <w:rFonts w:cs="Times New Roman"/>
+          <w:b/>
+          <w:bCs/>
+          <w:sz w:val="36"/>
+          <w:szCs w:val="36"/>
+        </w:rPr>
+        <w:lastRenderedPageBreak/>
+        <w:t>National College of Computer Studies</w:t>
+      </w:r>
+    </w:p>
+    <w:p>
+      <w:pPr>
+        <w:spacing w:after="149"/>
+        <w:ind w:right="26"/>
+        <w:jc w:val="center"/>
+        <w:rPr>
+          <w:rFonts w:cs="Times New Roman"/>
+          <w:b/>
+          <w:bCs/>
+          <w:sz w:val="32"/>
+          <w:szCs w:val="32"/>
+        </w:rPr>
+      </w:pPr>
+      <w:proofErr w:type="spellStart"/>
+      <w:r>
+        <w:rPr>
+          <w:rFonts w:cs="Times New Roman"/>
+          <w:b/>
+          <w:bCs/>
+          <w:sz w:val="32"/>
+          <w:szCs w:val="32"/>
+        </w:rPr>
+        <w:t>Paknajol</w:t>
+      </w:r>
+      <w:proofErr w:type="spellEnd"/>
+      <w:r>
+        <w:rPr>
+          <w:rFonts w:cs="Times New Roman"/>
+          <w:b/>
+          <w:bCs/>
+          <w:sz w:val="32"/>
+          <w:szCs w:val="32"/>
+        </w:rPr>
+        <w:t>, Kathmandu</w:t>
+      </w:r>
+    </w:p>
+    <w:p>
+      <w:pPr>
+        <w:spacing w:after="149"/>
+        <w:ind w:right="26"/>
+        <w:jc w:val="center"/>
+        <w:rPr>
+          <w:rFonts w:cs="Times New Roman"/>
+          <w:b/>
+          <w:bCs/>
+          <w:sz w:val="32"/>
+          <w:szCs w:val="32"/>
+        </w:rPr>
+      </w:pPr>
+    </w:p>
+    <w:p>
+      <w:pPr>
+        <w:spacing w:after="149"/>
+        <w:ind w:right="26"/>
+        <w:jc w:val="center"/>
+        <w:rPr>
+          <w:rFonts w:cs="Times New Roman"/>
+        </w:rPr>
+      </w:pPr>
+    </w:p>
+    <w:p>
+      <w:pPr>
+        <w:ind w:right="5034"/>
+        <w:rPr>
+          <w:rFonts w:cs="Times New Roman"/>
+        </w:rPr>
+      </w:pPr>
+    </w:p>
+    <w:p>
+      <w:pPr>
+        <w:spacing w:after="76"/>
+        <w:ind w:left="3914"/>
+        <w:rPr>
+          <w:rFonts w:cs="Times New Roman"/>
+        </w:rPr>
+      </w:pPr>
+      <w:r>
+        <w:rPr>
+          <w:rFonts w:cs="Times New Roman"/>
+          <w:noProof/>
+        </w:rPr>
+        <mc:AlternateContent>
+          <mc:Choice Requires="wpg">
+            <w:drawing>
+              <wp:inline distT="0" distB="0" distL="0" distR="0" wp14:anchorId="4D475306" wp14:editId="4448D928">
+                <wp:extent cx="609600" cy="2020570"/>
+                <wp:effectExtent l="0" t="0" r="0" b="0"/>
+                <wp:docPr id="1420918827" name="Group 1420918827"/>
+                <wp:cNvGraphicFramePr>
+                  <a:graphicFrameLocks xmlns:a="http://schemas.openxmlformats.org/drawingml/2006/main"/>
+                </wp:cNvGraphicFramePr>
+                <a:graphic xmlns:a="http://schemas.openxmlformats.org/drawingml/2006/main">
+                  <a:graphicData uri="http://schemas.microsoft.com/office/word/2010/wordprocessingGroup">
+                    <wpg:wgp>
+                      <wpg:cNvGrpSpPr>
+                        <a:grpSpLocks/>
+                      </wpg:cNvGrpSpPr>
+                      <wpg:grpSpPr bwMode="auto">
+                        <a:xfrm>
+                          <a:off x="0" y="0"/>
+                          <a:ext cx="609600" cy="2020570"/>
+                          <a:chOff x="0" y="0"/>
+                          <a:chExt cx="6096" cy="20208"/>
+                        </a:xfrm>
+                      </wpg:grpSpPr>
+                      <wps:wsp>
+                        <wps:cNvPr id="1908754167" name="Shape 40"/>
+                        <wps:cNvSpPr>
+                          <a:spLocks/>
+                        </wps:cNvSpPr>
+                        <wps:spPr bwMode="auto">
+                          <a:xfrm>
+                            <a:off x="0" y="3657"/>
+                            <a:ext cx="0" cy="13609"/>
+                          </a:xfrm>
+                          <a:custGeom>
+                            <a:avLst/>
+                            <a:gdLst>
+                              <a:gd name="T0" fmla="*/ 0 h 1360932"/>
+                              <a:gd name="T1" fmla="*/ 13609 h 1360932"/>
+                              <a:gd name="T2" fmla="*/ 0 60000 65536"/>
+                              <a:gd name="T3" fmla="*/ 0 60000 65536"/>
+                              <a:gd name="T4" fmla="*/ 0 h 1360932"/>
+                              <a:gd name="T5" fmla="*/ 1360932 h 1360932"/>
+                            </a:gdLst>
+                            <a:ahLst/>
+                            <a:cxnLst>
+                              <a:cxn ang="T2">
+                                <a:pos x="0" y="T0"/>
+                              </a:cxn>
+                              <a:cxn ang="T3">
+                                <a:pos x="0" y="T1"/>
+                              </a:cxn>
+                            </a:cxnLst>
+                            <a:rect l="0" t="T4" r="0" b="T5"/>
+                            <a:pathLst>
+                              <a:path h="1360932">
+                                <a:moveTo>
+                                  <a:pt x="0" y="0"/>
+                                </a:moveTo>
+                                <a:lnTo>
+                                  <a:pt x="0" y="1360932"/>
+                                </a:lnTo>
+                              </a:path>
+                            </a:pathLst>
+                          </a:custGeom>
+                          <a:noFill/>
+                          <a:ln w="11939">
+                            <a:solidFill>
+                              <a:srgbClr val="000000"/>
+                            </a:solidFill>
+                            <a:miter lim="101601"/>
+                            <a:headEnd/>
+                            <a:tailEnd/>
+                          </a:ln>
+                          <a:extLst>
+                            <a:ext uri="{909E8E84-426E-40DD-AFC4-6F175D3DCCD1}">
+                              <a14:hiddenFill xmlns:a14="http://schemas.microsoft.com/office/drawing/2010/main">
+                                <a:solidFill>
+                                  <a:srgbClr val="FFFFFF"/>
+                                </a:solidFill>
+                              </a14:hiddenFill>
+                            </a:ext>
+                          </a:extLst>
+                        </wps:spPr>
+                        <wps:bodyPr rot="0" vert="horz" wrap="square" lIns="91440" tIns="45720" rIns="91440" bIns="45720" anchor="t" anchorCtr="0" upright="1">
+                          <a:noAutofit/>
+                        </wps:bodyPr>
+                      </wps:wsp>
+                      <wps:wsp>
+                        <wps:cNvPr id="1923017452" name="Shape 41"/>
+                        <wps:cNvSpPr>
+                          <a:spLocks/>
+                        </wps:cNvSpPr>
+                        <wps:spPr bwMode="auto">
+                          <a:xfrm>
+                            <a:off x="2941" y="0"/>
+                            <a:ext cx="152" cy="20208"/>
+                          </a:xfrm>
+                          <a:custGeom>
+                            <a:avLst/>
+                            <a:gdLst>
+                              <a:gd name="T0" fmla="*/ 152 w 15240"/>
+                              <a:gd name="T1" fmla="*/ 0 h 2020824"/>
+                              <a:gd name="T2" fmla="*/ 0 w 15240"/>
+                              <a:gd name="T3" fmla="*/ 20208 h 2020824"/>
+                              <a:gd name="T4" fmla="*/ 0 60000 65536"/>
+                              <a:gd name="T5" fmla="*/ 0 60000 65536"/>
+                              <a:gd name="T6" fmla="*/ 0 w 15240"/>
+                              <a:gd name="T7" fmla="*/ 0 h 2020824"/>
+                              <a:gd name="T8" fmla="*/ 15240 w 15240"/>
+                              <a:gd name="T9" fmla="*/ 2020824 h 2020824"/>
+                            </a:gdLst>
+                            <a:ahLst/>
+                            <a:cxnLst>
+                              <a:cxn ang="T4">
+                                <a:pos x="T0" y="T1"/>
+                              </a:cxn>
+                              <a:cxn ang="T5">
+                                <a:pos x="T2" y="T3"/>
+                              </a:cxn>
+                            </a:cxnLst>
+                            <a:rect l="T6" t="T7" r="T8" b="T9"/>
+                            <a:pathLst>
+                              <a:path w="15240" h="2020824">
+                                <a:moveTo>
+                                  <a:pt x="15240" y="0"/>
+                                </a:moveTo>
+                                <a:lnTo>
+                                  <a:pt x="0" y="2020824"/>
+                                </a:lnTo>
+                              </a:path>
+                            </a:pathLst>
+                          </a:custGeom>
+                          <a:noFill/>
+                          <a:ln w="11939">
+                            <a:solidFill>
+                              <a:srgbClr val="000000"/>
+                            </a:solidFill>
+                            <a:miter lim="101601"/>
+                            <a:headEnd/>
+                            <a:tailEnd/>
+                          </a:ln>
+                          <a:extLst>
+                            <a:ext uri="{909E8E84-426E-40DD-AFC4-6F175D3DCCD1}">
+                              <a14:hiddenFill xmlns:a14="http://schemas.microsoft.com/office/drawing/2010/main">
+                                <a:solidFill>
+                                  <a:srgbClr val="FFFFFF"/>
+                                </a:solidFill>
+                              </a14:hiddenFill>
+                            </a:ext>
+                          </a:extLst>
+                        </wps:spPr>
+                        <wps:bodyPr rot="0" vert="horz" wrap="square" lIns="91440" tIns="45720" rIns="91440" bIns="45720" anchor="t" anchorCtr="0" upright="1">
+                          <a:noAutofit/>
+                        </wps:bodyPr>
+                      </wps:wsp>
+                      <wps:wsp>
+                        <wps:cNvPr id="160011742" name="Shape 42"/>
+                        <wps:cNvSpPr>
+                          <a:spLocks/>
+                        </wps:cNvSpPr>
+                        <wps:spPr bwMode="auto">
+                          <a:xfrm>
+                            <a:off x="6096" y="3642"/>
+                            <a:ext cx="0" cy="13609"/>
+                          </a:xfrm>
+                          <a:custGeom>
+                            <a:avLst/>
+                            <a:gdLst>
+                              <a:gd name="T0" fmla="*/ 0 h 1360932"/>
+                              <a:gd name="T1" fmla="*/ 13609 h 1360932"/>
+                              <a:gd name="T2" fmla="*/ 0 60000 65536"/>
+                              <a:gd name="T3" fmla="*/ 0 60000 65536"/>
+                              <a:gd name="T4" fmla="*/ 0 h 1360932"/>
+                              <a:gd name="T5" fmla="*/ 1360932 h 1360932"/>
+                            </a:gdLst>
+                            <a:ahLst/>
+                            <a:cxnLst>
+                              <a:cxn ang="T2">
+                                <a:pos x="0" y="T0"/>
+                              </a:cxn>
+                              <a:cxn ang="T3">
+                                <a:pos x="0" y="T1"/>
+                              </a:cxn>
+                            </a:cxnLst>
+                            <a:rect l="0" t="T4" r="0" b="T5"/>
+                            <a:pathLst>
+                              <a:path h="1360932">
+                                <a:moveTo>
+                                  <a:pt x="0" y="0"/>
+                                </a:moveTo>
+                                <a:lnTo>
+                                  <a:pt x="0" y="1360932"/>
+                                </a:lnTo>
+                              </a:path>
+                            </a:pathLst>
+                          </a:custGeom>
+                          <a:noFill/>
+                          <a:ln w="11939">
+                            <a:solidFill>
+                              <a:srgbClr val="000000"/>
+                            </a:solidFill>
+                            <a:miter lim="101601"/>
+                            <a:headEnd/>
+                            <a:tailEnd/>
+                          </a:ln>
+                          <a:extLst>
+                            <a:ext uri="{909E8E84-426E-40DD-AFC4-6F175D3DCCD1}">
+                              <a14:hiddenFill xmlns:a14="http://schemas.microsoft.com/office/drawing/2010/main">
+                                <a:solidFill>
+                                  <a:srgbClr val="FFFFFF"/>
+                                </a:solidFill>
+                              </a14:hiddenFill>
+                            </a:ext>
+                          </a:extLst>
+                        </wps:spPr>
+                        <wps:bodyPr rot="0" vert="horz" wrap="square" lIns="91440" tIns="45720" rIns="91440" bIns="45720" anchor="t" anchorCtr="0" upright="1">
+                          <a:noAutofit/>
+                        </wps:bodyPr>
+                      </wps:wsp>
+                    </wpg:wgp>
+                  </a:graphicData>
+                </a:graphic>
+              </wp:inline>
+            </w:drawing>
+          </mc:Choice>
+          <mc:Fallback>
+            <w:pict>
+              <v:group w14:anchorId="5CF5C59D" id="Group 1420918827" o:spid="_x0000_s1026" style="width:48pt;height:159.1pt;mso-position-horizontal-relative:char;mso-position-vertical-relative:line" coordsize="6096,20208" o:gfxdata="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">
+                <v:shape id="Shape 40" o:spid="_x0000_s1027" style="position:absolute;top:3657;width:0;height:13609;visibility:visible;mso-wrap-style:square;v-text-anchor:top" coordsize="0,1360932" o:gfxdata="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" path="m,l,1360932e" filled="f" strokeweight=".33164mm">
+                  <v:stroke miterlimit="66585f" joinstyle="miter"/>
+                  <v:path arrowok="t" o:connecttype="custom" o:connectlocs="0,0;0,136" o:connectangles="0,0" textboxrect="0,0,0,1360932"/>
+                </v:shape>
+                <v:shape id="Shape 41" o:spid="_x0000_s1028" style="position:absolute;left:2941;width:152;height:20208;visibility:visible;mso-wrap-style:square;v-text-anchor:top" coordsize="15240,2020824" o:gfxdata="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" path="m15240,l,2020824e" filled="f" strokeweight=".33164mm">
+                  <v:stroke miterlimit="66585f" joinstyle="miter"/>
+                  <v:path arrowok="t" o:connecttype="custom" o:connectlocs="2,0;0,202" o:connectangles="0,0" textboxrect="0,0,15240,2020824"/>
+                </v:shape>
+                <v:shape id="Shape 42" o:spid="_x0000_s1029" style="position:absolute;left:6096;top:3642;width:0;height:13609;visibility:visible;mso-wrap-style:square;v-text-anchor:top" coordsize="0,1360932" o:gfxdata="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" path="m,l,1360932e" filled="f" strokeweight=".33164mm">
+                  <v:stroke miterlimit="66585f" joinstyle="miter"/>
+                  <v:path arrowok="t" o:connecttype="custom" o:connectlocs="0,0;0,136" o:connectangles="0,0" textboxrect="0,0,0,1360932"/>
+                </v:shape>
+                <w10:anchorlock/>
+              </v:group>
+            </w:pict>
+          </mc:Fallback>
+        </mc:AlternateContent>
+      </w:r>
+    </w:p>
+    <w:p>
+      <w:pPr>
+        <w:spacing w:after="76"/>
+        <w:ind w:left="3914"/>
+        <w:rPr>
+          <w:rFonts w:cs="Times New Roman"/>
+        </w:rPr>
+      </w:pPr>
+    </w:p>
+    <w:p>
+      <w:pPr>
+        <w:spacing w:after="151"/>
+        <w:ind w:right="14"/>
+        <w:jc w:val="center"/>
+        <w:rPr>
+          <w:rFonts w:cs="Times New Roman"/>
+        </w:rPr>
+      </w:pPr>
+    </w:p>
+    <w:p>
+      <w:pPr>
+        <w:spacing w:after="151"/>
+        <w:ind w:right="14"/>
+        <w:jc w:val="center"/>
+        <w:rPr>
+          <w:rFonts w:cs="Times New Roman"/>
+        </w:rPr>
+      </w:pPr>
+    </w:p>
+    <w:p>
+      <w:pPr>
+        <w:spacing w:after="146"/>
+        <w:ind w:left="10" w:right="72" w:hanging="10"/>
+        <w:jc w:val="center"/>
+        <w:rPr>
+          <w:rFonts w:cs="Times New Roman"/>
+          <w:sz w:val="28"/>
+          <w:szCs w:val="28"/>
+        </w:rPr>
+      </w:pPr>
+      <w:r>
+        <w:rPr>
+          <w:rFonts w:cs="Times New Roman"/>
+          <w:sz w:val="28"/>
+          <w:szCs w:val="28"/>
+        </w:rPr>
+        <w:t xml:space="preserve">Lab Report No. </w:t>
+      </w:r>
+      <w:r>
+        <w:rPr>
+          <w:rFonts w:cs="Times New Roman"/>
+          <w:sz w:val="28"/>
+          <w:szCs w:val="28"/>
+        </w:rPr>
+        <w:t>7</w:t>
+      </w:r>
+    </w:p>
+    <w:p>
+      <w:pPr>
+        <w:spacing w:after="146"/>
+        <w:ind w:left="10" w:right="72" w:hanging="10"/>
+        <w:jc w:val="center"/>
+        <w:rPr>
+          <w:rFonts w:cs="Times New Roman"/>
+          <w:b/>
+          <w:bCs/>
+          <w:sz w:val="28"/>
+          <w:szCs w:val="28"/>
+        </w:rPr>
+      </w:pPr>
+      <w:r>
+        <w:rPr>
+          <w:rFonts w:cs="Times New Roman"/>
+          <w:b/>
+          <w:bCs/>
+          <w:sz w:val="28"/>
+          <w:szCs w:val="28"/>
+        </w:rPr>
+        <w:t>Programming with Python</w:t>
+      </w:r>
+    </w:p>
+    <w:p>
+      <w:pPr>
+        <w:spacing w:after="146"/>
+        <w:ind w:left="10" w:right="72" w:hanging="10"/>
+        <w:jc w:val="center"/>
+        <w:rPr>
+          <w:rFonts w:cs="Times New Roman"/>
+          <w:b/>
+          <w:bCs/>
+          <w:sz w:val="28"/>
+          <w:szCs w:val="28"/>
+        </w:rPr>
+      </w:pPr>
+    </w:p>
+    <w:p>
+      <w:pPr>
+        <w:spacing w:after="149"/>
+        <w:rPr>
+          <w:rFonts w:cs="Times New Roman"/>
+        </w:rPr>
+      </w:pPr>
+    </w:p>
+    <w:p>
+      <w:pPr>
+        <w:spacing w:after="139"/>
+        <w:ind w:left="-5" w:hanging="10"/>
+        <w:rPr>
+          <w:rFonts w:cs="Times New Roman"/>
+          <w:sz w:val="28"/>
+          <w:szCs w:val="28"/>
+        </w:rPr>
+      </w:pPr>
+      <w:r>
+        <w:rPr>
+          <w:rFonts w:cs="Times New Roman"/>
+          <w:b/>
+          <w:bCs/>
+          <w:sz w:val="28"/>
+          <w:szCs w:val="28"/>
+        </w:rPr>
+        <w:t>Submitted by</w:t>
+      </w:r>
+      <w:r>
+        <w:rPr>
+          <w:rFonts w:cs="Times New Roman"/>
+          <w:sz w:val="28"/>
+          <w:szCs w:val="28"/>
+        </w:rPr>
+        <w:t xml:space="preserve">: </w:t>
+      </w:r>
+      <w:r>
+        <w:rPr>
+          <w:rFonts w:cs="Times New Roman"/>
+          <w:sz w:val="28"/>
+          <w:szCs w:val="28"/>
+        </w:rPr>
+        <w:tab/>
+      </w:r>
+      <w:r>
+        <w:rPr>
+          <w:rFonts w:cs="Times New Roman"/>
+          <w:sz w:val="28"/>
+          <w:szCs w:val="28"/>
+        </w:rPr>
+        <w:tab/>
+      </w:r>
+      <w:r>
+        <w:rPr>
+          <w:rFonts w:cs="Times New Roman"/>
+          <w:sz w:val="28"/>
+          <w:szCs w:val="28"/>
+        </w:rPr>
+        <w:tab/>
+      </w:r>
+      <w:r>
+        <w:rPr>
+          <w:rFonts w:cs="Times New Roman"/>
+          <w:sz w:val="28"/>
+          <w:szCs w:val="28"/>
+        </w:rPr>
+        <w:tab/>
+      </w:r>
+      <w:r>
+        <w:rPr>
+          <w:rFonts w:cs="Times New Roman"/>
+          <w:sz w:val="28"/>
+          <w:szCs w:val="28"/>
+        </w:rPr>
+        <w:tab/>
+      </w:r>
+      <w:r>
+        <w:rPr>
+          <w:rFonts w:cs="Times New Roman"/>
+          <w:sz w:val="28"/>
+          <w:szCs w:val="28"/>
+        </w:rPr>
+        <w:tab/>
+      </w:r>
+      <w:r>
+        <w:rPr>
+          <w:rFonts w:cs="Times New Roman"/>
+          <w:b/>
+          <w:bCs/>
+          <w:sz w:val="28"/>
+          <w:szCs w:val="28"/>
+        </w:rPr>
+        <w:t xml:space="preserve">   Submitted to:</w:t>
+      </w:r>
+    </w:p>
+    <w:p>
+      <w:pPr>
+        <w:spacing w:after="139"/>
+        <w:ind w:left="-5" w:hanging="10"/>
+        <w:rPr>
+          <w:rFonts w:cs="Times New Roman"/>
+          <w:sz w:val="28"/>
+          <w:szCs w:val="28"/>
+        </w:rPr>
+      </w:pPr>
+      <w:r>
+        <w:rPr>
+          <w:rFonts w:cs="Times New Roman"/>
+          <w:sz w:val="28"/>
+          <w:szCs w:val="28"/>
+        </w:rPr>
+        <w:t xml:space="preserve">Name: Siddhartha Shakya                              </w:t>
+      </w:r>
+      <w:r>
+        <w:rPr>
+          <w:rFonts w:cs="Times New Roman"/>
+          <w:sz w:val="28"/>
+          <w:szCs w:val="28"/>
+        </w:rPr>
+        <w:tab/>
+      </w:r>
+      <w:r>
+        <w:rPr>
+          <w:rFonts w:cs="Times New Roman"/>
+          <w:sz w:val="28"/>
+          <w:szCs w:val="28"/>
+        </w:rPr>
+        <w:tab/>
+        <w:t xml:space="preserve">  </w:t>
+      </w:r>
+      <w:r>
+        <w:rPr>
+          <w:rFonts w:cs="Times New Roman"/>
+          <w:sz w:val="28"/>
+          <w:szCs w:val="28"/>
+        </w:rPr>
+        <w:t xml:space="preserve"> Sumit </w:t>
+      </w:r>
+      <w:proofErr w:type="spellStart"/>
+      <w:r>
+        <w:rPr>
+          <w:rFonts w:cs="Times New Roman"/>
+          <w:sz w:val="28"/>
+          <w:szCs w:val="28"/>
+        </w:rPr>
+        <w:t>Ghising</w:t>
+      </w:r>
+      <w:proofErr w:type="spellEnd"/>
+      <w:r>
+        <w:rPr>
+          <w:rFonts w:cs="Times New Roman"/>
+          <w:sz w:val="28"/>
+          <w:szCs w:val="28"/>
+        </w:rPr>
+        <w:tab/>
+        <w:t xml:space="preserve">  </w:t>
+      </w:r>
+    </w:p>
+    <w:p>
+      <w:pPr>
+        <w:spacing w:after="187"/>
+        <w:ind w:left="-5" w:hanging="10"/>
+        <w:rPr>
+          <w:rFonts w:cs="Times New Roman"/>
+          <w:sz w:val="28"/>
+          <w:szCs w:val="28"/>
+        </w:rPr>
+      </w:pPr>
+      <w:r>
+        <w:rPr>
+          <w:rFonts w:cs="Times New Roman"/>
+          <w:sz w:val="28"/>
+          <w:szCs w:val="28"/>
+        </w:rPr>
+        <w:t>Program: BIM</w:t>
+      </w:r>
+      <w:r>
+        <w:rPr>
+          <w:rFonts w:cs="Times New Roman"/>
+          <w:sz w:val="28"/>
+          <w:szCs w:val="28"/>
+        </w:rPr>
+        <w:tab/>
+        <w:t xml:space="preserve">            </w:t>
+      </w:r>
+      <w:r>
+        <w:rPr>
+          <w:rFonts w:cs="Times New Roman"/>
+          <w:sz w:val="28"/>
+          <w:szCs w:val="28"/>
+        </w:rPr>
+        <w:tab/>
+      </w:r>
+      <w:r>
+        <w:rPr>
+          <w:rFonts w:cs="Times New Roman"/>
+          <w:sz w:val="28"/>
+          <w:szCs w:val="28"/>
+        </w:rPr>
+        <w:tab/>
+      </w:r>
+      <w:r>
+        <w:rPr>
+          <w:rFonts w:cs="Times New Roman"/>
+          <w:sz w:val="28"/>
+          <w:szCs w:val="28"/>
+        </w:rPr>
+        <w:tab/>
+      </w:r>
+      <w:r>
+        <w:rPr>
+          <w:rFonts w:cs="Times New Roman"/>
+          <w:sz w:val="28"/>
+          <w:szCs w:val="28"/>
+        </w:rPr>
+        <w:tab/>
+        <w:t xml:space="preserve">   </w:t>
+      </w:r>
+    </w:p>
+    <w:p>
+      <w:pPr>
+        <w:spacing w:after="187"/>
+        <w:ind w:left="-5" w:hanging="10"/>
+        <w:rPr>
+          <w:rFonts w:cs="Times New Roman"/>
+          <w:sz w:val="28"/>
+          <w:szCs w:val="28"/>
+        </w:rPr>
+      </w:pPr>
+      <w:r>
+        <w:rPr>
+          <w:rFonts w:cs="Times New Roman"/>
+          <w:sz w:val="28"/>
+          <w:szCs w:val="28"/>
+        </w:rPr>
+        <w:t xml:space="preserve">Roll no: </w:t>
+      </w:r>
+      <w:r>
+        <w:rPr>
+          <w:rFonts w:cs="Times New Roman"/>
+          <w:sz w:val="28"/>
+          <w:szCs w:val="28"/>
+        </w:rPr>
+        <w:t>18</w:t>
+      </w:r>
+      <w:r>
+        <w:rPr>
+          <w:rFonts w:cs="Times New Roman"/>
+          <w:sz w:val="28"/>
+          <w:szCs w:val="28"/>
+        </w:rPr>
+        <w:tab/>
+      </w:r>
+      <w:r>
+        <w:rPr>
+          <w:rFonts w:cs="Times New Roman"/>
+          <w:sz w:val="28"/>
+          <w:szCs w:val="28"/>
+        </w:rPr>
+        <w:tab/>
+      </w:r>
+      <w:r>
+        <w:rPr>
+          <w:rFonts w:cs="Times New Roman"/>
+          <w:sz w:val="28"/>
+          <w:szCs w:val="28"/>
+        </w:rPr>
+        <w:tab/>
+      </w:r>
+      <w:r>
+        <w:rPr>
+          <w:rFonts w:cs="Times New Roman"/>
+          <w:sz w:val="28"/>
+          <w:szCs w:val="28"/>
+        </w:rPr>
+        <w:tab/>
+        <w:t xml:space="preserve">             </w:t>
+      </w:r>
+    </w:p>
+    <w:p>
+      <w:pPr>
+        <w:tabs>
+          <w:tab w:val="left" w:pos="6348"/>
+        </w:tabs>
+        <w:spacing w:after="171"/>
+        <w:ind w:left="-5" w:hanging="10"/>
+        <w:rPr>
+          <w:rFonts w:cs="Times New Roman"/>
+          <w:sz w:val="28"/>
+          <w:szCs w:val="28"/>
+        </w:rPr>
+      </w:pPr>
+      <w:r>
+        <w:rPr>
+          <w:rFonts w:cs="Times New Roman"/>
+          <w:sz w:val="28"/>
+          <w:szCs w:val="28"/>
+        </w:rPr>
+        <w:t xml:space="preserve">Section: B </w:t>
+      </w:r>
+      <w:r>
+        <w:rPr>
+          <w:rFonts w:cs="Times New Roman"/>
+          <w:sz w:val="28"/>
+          <w:szCs w:val="28"/>
+        </w:rPr>
+        <w:tab/>
+      </w:r>
+    </w:p>
+    <w:p>
+      <w:pPr>
+        <w:tabs>
+          <w:tab w:val="center" w:pos="2707"/>
+          <w:tab w:val="center" w:pos="3384"/>
+          <w:tab w:val="center" w:pos="4061"/>
+        </w:tabs>
+        <w:spacing w:after="139"/>
+        <w:ind w:left="-15"/>
+        <w:rPr>
+          <w:rFonts w:cs="Times New Roman"/>
+          <w:sz w:val="28"/>
+          <w:szCs w:val="28"/>
+        </w:rPr>
+      </w:pPr>
+      <w:r>
+        <w:rPr>
+          <w:rFonts w:cs="Times New Roman"/>
+          <w:sz w:val="28"/>
+          <w:szCs w:val="28"/>
+        </w:rPr>
+        <w:tab/>
+      </w:r>
+      <w:r>
+        <w:rPr>
+          <w:rFonts w:cs="Times New Roman"/>
+          <w:sz w:val="28"/>
+          <w:szCs w:val="28"/>
+        </w:rPr>
+        <w:tab/>
+      </w:r>
+      <w:r>
+        <w:rPr>
+          <w:rFonts w:cs="Times New Roman"/>
+          <w:sz w:val="28"/>
+          <w:szCs w:val="28"/>
+        </w:rPr>
+        <w:tab/>
+      </w:r>
+    </w:p>
+    <w:p>
+      <w:pPr>
+        <w:spacing w:line="259" w:lineRule="auto"/>
+        <w:rPr>
+          <w:sz w:val="28"/>
+          <w:szCs w:val="28"/>
+        </w:rPr>
+      </w:pPr>
+      <w:r>
+        <w:rPr>
+          <w:noProof/>
+          <w:sz w:val="28"/>
+          <w:szCs w:val="28"/>
+        </w:rPr>
+        <mc:AlternateContent>
+          <mc:Choice Requires="wps">
+            <w:drawing>
+              <wp:anchor distT="0" distB="0" distL="114300" distR="114300" simplePos="0" relativeHeight="251661312" behindDoc="0" locked="0" layoutInCell="1" allowOverlap="1" wp14:anchorId="39BFB46A" wp14:editId="0A791B08">
+                <wp:simplePos x="0" y="0"/>
+                <wp:positionH relativeFrom="margin">
+                  <wp:posOffset>1677907</wp:posOffset>
+                </wp:positionH>
+                <wp:positionV relativeFrom="paragraph">
+                  <wp:posOffset>228653</wp:posOffset>
+                </wp:positionV>
+                <wp:extent cx="2231756" cy="410705"/>
+                <wp:effectExtent l="0" t="0" r="3810" b="0"/>
+                <wp:wrapNone/>
+                <wp:docPr id="1490122114" name="Text Box 1490122114"/>
+                <wp:cNvGraphicFramePr/>
+                <a:graphic xmlns:a="http://schemas.openxmlformats.org/drawingml/2006/main">
+                  <a:graphicData uri="http://schemas.microsoft.com/office/word/2010/wordprocessingShape">
+                    <wps:wsp>
+                      <wps:cNvSpPr txBox="1"/>
+                      <wps:spPr>
+                        <a:xfrm>
+                          <a:off x="0" y="0"/>
+                          <a:ext cx="2231756" cy="410705"/>
+                        </a:xfrm>
+                        <a:prstGeom prst="rect">
+                          <a:avLst/>
+                        </a:prstGeom>
+                        <a:solidFill>
+                          <a:schemeClr val="lt1"/>
+                        </a:solidFill>
+                        <a:ln w="6350">
+                          <a:noFill/>
+                        </a:ln>
+                      </wps:spPr>
+                      <wps:txbx>
+                        <w:txbxContent>
+                          <w:p>
+                            <w:pPr>
+                              <w:jc w:val="center"/>
+                            </w:pPr>
+                            <w:r>
+                              <w:rPr>
+                                <w:b/>
+                                <w:bCs/>
+                              </w:rPr>
+                              <w:t>Date of submission:</w:t>
+                            </w:r>
+                            <w:r>
+                              <w:t xml:space="preserve"> </w:t>
+                            </w:r>
+                          </w:p>
+                        </w:txbxContent>
+                      </wps:txbx>
+                      <wps:bodyPr rot="0" spcFirstLastPara="0" vertOverflow="overflow" horzOverflow="overflow" vert="horz" wrap="square" lIns="91440" tIns="45720" rIns="91440" bIns="45720" numCol="1" spcCol="0" rtlCol="0" fromWordArt="0" anchor="t" anchorCtr="0" forceAA="0" compatLnSpc="1">
+                        <a:prstTxWarp prst="textNoShape">
+                          <a:avLst/>
+                        </a:prstTxWarp>
+                        <a:noAutofit/>
+                      </wps:bodyPr>
+                    </wps:wsp>
+                  </a:graphicData>
+                </a:graphic>
+              </wp:anchor>
+            </w:drawing>
+          </mc:Choice>
+          <mc:Fallback>
+            <w:pict>
+              <v:shape w14:anchorId="39BFB46A" id="Text Box 1490122114" o:spid="_x0000_s1028" type="#_x0000_t202" style="position:absolute;margin-left:132.1pt;margin-top:18pt;width:175.75pt;height:32.35pt;z-index:251661312;visibility:visible;mso-wrap-style:square;mso-wrap-distance-left:9pt;mso-wrap-distance-top:0;mso-wrap-distance-right:9pt;mso-wrap-distance-bottom:0;mso-position-horizontal:absolute;mso-position-horizontal-relative:margin;mso-position-vertical:absolute;mso-position-vertical-relative:text;v-text-anchor:top" o:gfxdata="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" fillcolor="white [3201]" stroked="f" strokeweight=".5pt">
+                <v:textbox>
+                  <w:txbxContent>
+                    <w:p>
+                      <w:pPr>
+                        <w:jc w:val="center"/>
+                      </w:pPr>
+                      <w:r>
+                        <w:rPr>
+                          <w:b/>
+                          <w:bCs/>
+                        </w:rPr>
+                        <w:t>Date of submission:</w:t>
+                      </w:r>
+                      <w:r>
+                        <w:t xml:space="preserve"> </w:t>
+                      </w:r>
+                    </w:p>
+                  </w:txbxContent>
+                </v:textbox>
+                <w10:wrap anchorx="margin"/>
+              </v:shape>
+            </w:pict>
+          </mc:Fallback>
+        </mc:AlternateContent>
+      </w:r>
+    </w:p>
+    <w:p/>
+    <w:p>
+      <w:pPr>
+        <w:spacing w:after="160" w:line="278" w:lineRule="auto"/>
+      </w:pPr>
+    </w:p>
+    <w:p/>
+    <w:p>
+      <w:pPr>
+        <w:spacing w:after="160" w:line="278" w:lineRule="auto"/>
+      </w:pPr>
+      <w:r>
+        <w:br w:type="page"/>
+      </w:r>
+    </w:p>
+    <w:p/>
+    <w:p>
+      <w:pPr>
+        <w:spacing w:after="149"/>
+        <w:ind w:right="26"/>
+        <w:jc w:val="center"/>
+        <w:rPr>
+          <w:rFonts w:cs="Times New Roman"/>
+          <w:b/>
+          <w:bCs/>
+          <w:sz w:val="36"/>
+          <w:szCs w:val="36"/>
+        </w:rPr>
+      </w:pPr>
+      <w:r>
+        <w:rPr>
+          <w:rFonts w:cs="Times New Roman"/>
+          <w:b/>
+          <w:bCs/>
+          <w:sz w:val="36"/>
+          <w:szCs w:val="36"/>
+        </w:rPr>
+        <w:t>National College of Computer Studies</w:t>
+      </w:r>
+    </w:p>
+    <w:p>
+      <w:pPr>
+        <w:spacing w:after="149"/>
+        <w:ind w:right="26"/>
+        <w:jc w:val="center"/>
+        <w:rPr>
+          <w:rFonts w:cs="Times New Roman"/>
+          <w:b/>
+          <w:bCs/>
+          <w:sz w:val="32"/>
+          <w:szCs w:val="32"/>
+        </w:rPr>
+      </w:pPr>
+      <w:proofErr w:type="spellStart"/>
+      <w:r>
+        <w:rPr>
+          <w:rFonts w:cs="Times New Roman"/>
+          <w:b/>
+          <w:bCs/>
+          <w:sz w:val="32"/>
+          <w:szCs w:val="32"/>
+        </w:rPr>
+        <w:t>Paknajol</w:t>
+      </w:r>
+      <w:proofErr w:type="spellEnd"/>
+      <w:r>
+        <w:rPr>
+          <w:rFonts w:cs="Times New Roman"/>
+          <w:b/>
+          <w:bCs/>
+          <w:sz w:val="32"/>
+          <w:szCs w:val="32"/>
+        </w:rPr>
+        <w:t>, Kathmandu</w:t>
+      </w:r>
+    </w:p>
+    <w:p>
+      <w:pPr>
+        <w:spacing w:after="149"/>
+        <w:ind w:right="26"/>
+        <w:jc w:val="center"/>
+        <w:rPr>
+          <w:rFonts w:cs="Times New Roman"/>
+          <w:b/>
+          <w:bCs/>
+          <w:sz w:val="32"/>
+          <w:szCs w:val="32"/>
+        </w:rPr>
+      </w:pPr>
+    </w:p>
+    <w:p>
+      <w:pPr>
+        <w:spacing w:after="149"/>
+        <w:ind w:right="26"/>
+        <w:jc w:val="center"/>
+        <w:rPr>
+          <w:rFonts w:cs="Times New Roman"/>
+        </w:rPr>
+      </w:pPr>
+    </w:p>
+    <w:p>
+      <w:pPr>
+        <w:ind w:right="5034"/>
+        <w:rPr>
+          <w:rFonts w:cs="Times New Roman"/>
+        </w:rPr>
+      </w:pPr>
+    </w:p>
+    <w:p>
+      <w:pPr>
+        <w:spacing w:after="76"/>
+        <w:ind w:left="3914"/>
+        <w:rPr>
+          <w:rFonts w:cs="Times New Roman"/>
+        </w:rPr>
+      </w:pPr>
+      <w:r>
+        <w:rPr>
+          <w:rFonts w:cs="Times New Roman"/>
+          <w:noProof/>
+        </w:rPr>
+        <mc:AlternateContent>
+          <mc:Choice Requires="wpg">
+            <w:drawing>
+              <wp:inline distT="0" distB="0" distL="0" distR="0" wp14:anchorId="2BEB96C5" wp14:editId="0803D1B8">
+                <wp:extent cx="609600" cy="2020570"/>
+                <wp:effectExtent l="0" t="0" r="0" b="0"/>
+                <wp:docPr id="650667139" name="Group 650667139"/>
+                <wp:cNvGraphicFramePr>
+                  <a:graphicFrameLocks xmlns:a="http://schemas.openxmlformats.org/drawingml/2006/main"/>
+                </wp:cNvGraphicFramePr>
+                <a:graphic xmlns:a="http://schemas.openxmlformats.org/drawingml/2006/main">
+                  <a:graphicData uri="http://schemas.microsoft.com/office/word/2010/wordprocessingGroup">
+                    <wpg:wgp>
+                      <wpg:cNvGrpSpPr>
+                        <a:grpSpLocks/>
+                      </wpg:cNvGrpSpPr>
+                      <wpg:grpSpPr bwMode="auto">
+                        <a:xfrm>
+                          <a:off x="0" y="0"/>
+                          <a:ext cx="609600" cy="2020570"/>
+                          <a:chOff x="0" y="0"/>
+                          <a:chExt cx="6096" cy="20208"/>
+                        </a:xfrm>
+                      </wpg:grpSpPr>
+                      <wps:wsp>
+                        <wps:cNvPr id="1619301847" name="Shape 40"/>
+                        <wps:cNvSpPr>
+                          <a:spLocks/>
+                        </wps:cNvSpPr>
+                        <wps:spPr bwMode="auto">
+                          <a:xfrm>
+                            <a:off x="0" y="3657"/>
+                            <a:ext cx="0" cy="13609"/>
+                          </a:xfrm>
+                          <a:custGeom>
+                            <a:avLst/>
+                            <a:gdLst>
+                              <a:gd name="T0" fmla="*/ 0 h 1360932"/>
+                              <a:gd name="T1" fmla="*/ 13609 h 1360932"/>
+                              <a:gd name="T2" fmla="*/ 0 60000 65536"/>
+                              <a:gd name="T3" fmla="*/ 0 60000 65536"/>
+                              <a:gd name="T4" fmla="*/ 0 h 1360932"/>
+                              <a:gd name="T5" fmla="*/ 1360932 h 1360932"/>
+                            </a:gdLst>
+                            <a:ahLst/>
+                            <a:cxnLst>
+                              <a:cxn ang="T2">
+                                <a:pos x="0" y="T0"/>
+                              </a:cxn>
+                              <a:cxn ang="T3">
+                                <a:pos x="0" y="T1"/>
+                              </a:cxn>
+                            </a:cxnLst>
+                            <a:rect l="0" t="T4" r="0" b="T5"/>
+                            <a:pathLst>
+                              <a:path h="1360932">
+                                <a:moveTo>
+                                  <a:pt x="0" y="0"/>
+                                </a:moveTo>
+                                <a:lnTo>
+                                  <a:pt x="0" y="1360932"/>
+                                </a:lnTo>
+                              </a:path>
+                            </a:pathLst>
+                          </a:custGeom>
+                          <a:noFill/>
+                          <a:ln w="11939">
+                            <a:solidFill>
+                              <a:srgbClr val="000000"/>
+                            </a:solidFill>
+                            <a:miter lim="101601"/>
+                            <a:headEnd/>
+                            <a:tailEnd/>
+                          </a:ln>
+                          <a:extLst>
+                            <a:ext uri="{909E8E84-426E-40DD-AFC4-6F175D3DCCD1}">
+                              <a14:hiddenFill xmlns:a14="http://schemas.microsoft.com/office/drawing/2010/main">
+                                <a:solidFill>
+                                  <a:srgbClr val="FFFFFF"/>
+                                </a:solidFill>
+                              </a14:hiddenFill>
+                            </a:ext>
+                          </a:extLst>
+                        </wps:spPr>
+                        <wps:bodyPr rot="0" vert="horz" wrap="square" lIns="91440" tIns="45720" rIns="91440" bIns="45720" anchor="t" anchorCtr="0" upright="1">
+                          <a:noAutofit/>
+                        </wps:bodyPr>
+                      </wps:wsp>
+                      <wps:wsp>
+                        <wps:cNvPr id="1121197715" name="Shape 41"/>
+                        <wps:cNvSpPr>
+                          <a:spLocks/>
+                        </wps:cNvSpPr>
+                        <wps:spPr bwMode="auto">
+                          <a:xfrm>
+                            <a:off x="2941" y="0"/>
+                            <a:ext cx="152" cy="20208"/>
+                          </a:xfrm>
+                          <a:custGeom>
+                            <a:avLst/>
+                            <a:gdLst>
+                              <a:gd name="T0" fmla="*/ 152 w 15240"/>
+                              <a:gd name="T1" fmla="*/ 0 h 2020824"/>
+                              <a:gd name="T2" fmla="*/ 0 w 15240"/>
+                              <a:gd name="T3" fmla="*/ 20208 h 2020824"/>
+                              <a:gd name="T4" fmla="*/ 0 60000 65536"/>
+                              <a:gd name="T5" fmla="*/ 0 60000 65536"/>
+                              <a:gd name="T6" fmla="*/ 0 w 15240"/>
+                              <a:gd name="T7" fmla="*/ 0 h 2020824"/>
+                              <a:gd name="T8" fmla="*/ 15240 w 15240"/>
+                              <a:gd name="T9" fmla="*/ 2020824 h 2020824"/>
+                            </a:gdLst>
+                            <a:ahLst/>
+                            <a:cxnLst>
+                              <a:cxn ang="T4">
+                                <a:pos x="T0" y="T1"/>
+                              </a:cxn>
+                              <a:cxn ang="T5">
+                                <a:pos x="T2" y="T3"/>
+                              </a:cxn>
+                            </a:cxnLst>
+                            <a:rect l="T6" t="T7" r="T8" b="T9"/>
+                            <a:pathLst>
+                              <a:path w="15240" h="2020824">
+                                <a:moveTo>
+                                  <a:pt x="15240" y="0"/>
+                                </a:moveTo>
+                                <a:lnTo>
+                                  <a:pt x="0" y="2020824"/>
+                                </a:lnTo>
+                              </a:path>
+                            </a:pathLst>
+                          </a:custGeom>
+                          <a:noFill/>
+                          <a:ln w="11939">
+                            <a:solidFill>
+                              <a:srgbClr val="000000"/>
+                            </a:solidFill>
+                            <a:miter lim="101601"/>
+                            <a:headEnd/>
+                            <a:tailEnd/>
+                          </a:ln>
+                          <a:extLst>
+                            <a:ext uri="{909E8E84-426E-40DD-AFC4-6F175D3DCCD1}">
+                              <a14:hiddenFill xmlns:a14="http://schemas.microsoft.com/office/drawing/2010/main">
+                                <a:solidFill>
+                                  <a:srgbClr val="FFFFFF"/>
+                                </a:solidFill>
+                              </a14:hiddenFill>
+                            </a:ext>
+                          </a:extLst>
+                        </wps:spPr>
+                        <wps:bodyPr rot="0" vert="horz" wrap="square" lIns="91440" tIns="45720" rIns="91440" bIns="45720" anchor="t" anchorCtr="0" upright="1">
+                          <a:noAutofit/>
+                        </wps:bodyPr>
+                      </wps:wsp>
+                      <wps:wsp>
+                        <wps:cNvPr id="1224244655" name="Shape 42"/>
+                        <wps:cNvSpPr>
+                          <a:spLocks/>
+                        </wps:cNvSpPr>
+                        <wps:spPr bwMode="auto">
+                          <a:xfrm>
+                            <a:off x="6096" y="3642"/>
+                            <a:ext cx="0" cy="13609"/>
+                          </a:xfrm>
+                          <a:custGeom>
+                            <a:avLst/>
+                            <a:gdLst>
+                              <a:gd name="T0" fmla="*/ 0 h 1360932"/>
+                              <a:gd name="T1" fmla="*/ 13609 h 1360932"/>
+                              <a:gd name="T2" fmla="*/ 0 60000 65536"/>
+                              <a:gd name="T3" fmla="*/ 0 60000 65536"/>
+                              <a:gd name="T4" fmla="*/ 0 h 1360932"/>
+                              <a:gd name="T5" fmla="*/ 1360932 h 1360932"/>
+                            </a:gdLst>
+                            <a:ahLst/>
+                            <a:cxnLst>
+                              <a:cxn ang="T2">
+                                <a:pos x="0" y="T0"/>
+                              </a:cxn>
+                              <a:cxn ang="T3">
+                                <a:pos x="0" y="T1"/>
+                              </a:cxn>
+                            </a:cxnLst>
+                            <a:rect l="0" t="T4" r="0" b="T5"/>
+                            <a:pathLst>
+                              <a:path h="1360932">
+                                <a:moveTo>
+                                  <a:pt x="0" y="0"/>
+                                </a:moveTo>
+                                <a:lnTo>
+                                  <a:pt x="0" y="1360932"/>
+                                </a:lnTo>
+                              </a:path>
+                            </a:pathLst>
+                          </a:custGeom>
+                          <a:noFill/>
+                          <a:ln w="11939">
+                            <a:solidFill>
+                              <a:srgbClr val="000000"/>
+                            </a:solidFill>
+                            <a:miter lim="101601"/>
+                            <a:headEnd/>
+                            <a:tailEnd/>
+                          </a:ln>
+                          <a:extLst>
+                            <a:ext uri="{909E8E84-426E-40DD-AFC4-6F175D3DCCD1}">
+                              <a14:hiddenFill xmlns:a14="http://schemas.microsoft.com/office/drawing/2010/main">
+                                <a:solidFill>
+                                  <a:srgbClr val="FFFFFF"/>
+                                </a:solidFill>
+                              </a14:hiddenFill>
+                            </a:ext>
+                          </a:extLst>
+                        </wps:spPr>
+                        <wps:bodyPr rot="0" vert="horz" wrap="square" lIns="91440" tIns="45720" rIns="91440" bIns="45720" anchor="t" anchorCtr="0" upright="1">
+                          <a:noAutofit/>
+                        </wps:bodyPr>
+                      </wps:wsp>
+                    </wpg:wgp>
+                  </a:graphicData>
+                </a:graphic>
+              </wp:inline>
+            </w:drawing>
+          </mc:Choice>
+          <mc:Fallback>
+            <w:pict>
+              <v:group w14:anchorId="1521912A" id="Group 650667139" o:spid="_x0000_s1026" style="width:48pt;height:159.1pt;mso-position-horizontal-relative:char;mso-position-vertical-relative:line" coordsize="6096,20208" o:gfxdata="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">
+                <v:shape id="Shape 40" o:spid="_x0000_s1027" style="position:absolute;top:3657;width:0;height:13609;visibility:visible;mso-wrap-style:square;v-text-anchor:top" coordsize="0,1360932" o:gfxdata="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" path="m,l,1360932e" filled="f" strokeweight=".33164mm">
+                  <v:stroke miterlimit="66585f" joinstyle="miter"/>
+                  <v:path arrowok="t" o:connecttype="custom" o:connectlocs="0,0;0,136" o:connectangles="0,0" textboxrect="0,0,0,1360932"/>
+                </v:shape>
+                <v:shape id="Shape 41" o:spid="_x0000_s1028" style="position:absolute;left:2941;width:152;height:20208;visibility:visible;mso-wrap-style:square;v-text-anchor:top" coordsize="15240,2020824" o:gfxdata="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" path="m15240,l,2020824e" filled="f" strokeweight=".33164mm">
+                  <v:stroke miterlimit="66585f" joinstyle="miter"/>
+                  <v:path arrowok="t" o:connecttype="custom" o:connectlocs="2,0;0,202" o:connectangles="0,0" textboxrect="0,0,15240,2020824"/>
+                </v:shape>
+                <v:shape id="Shape 42" o:spid="_x0000_s1029" style="position:absolute;left:6096;top:3642;width:0;height:13609;visibility:visible;mso-wrap-style:square;v-text-anchor:top" coordsize="0,1360932" o:gfxdata="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" path="m,l,1360932e" filled="f" strokeweight=".33164mm">
+                  <v:stroke miterlimit="66585f" joinstyle="miter"/>
+                  <v:path arrowok="t" o:connecttype="custom" o:connectlocs="0,0;0,136" o:connectangles="0,0" textboxrect="0,0,0,1360932"/>
+                </v:shape>
+                <w10:anchorlock/>
+              </v:group>
+            </w:pict>
+          </mc:Fallback>
+        </mc:AlternateContent>
+      </w:r>
+    </w:p>
+    <w:p>
+      <w:pPr>
+        <w:spacing w:after="76"/>
+        <w:ind w:left="3914"/>
+        <w:rPr>
+          <w:rFonts w:cs="Times New Roman"/>
+        </w:rPr>
+      </w:pPr>
+    </w:p>
+    <w:p>
+      <w:pPr>
+        <w:spacing w:after="151"/>
+        <w:ind w:right="14"/>
+        <w:jc w:val="center"/>
+        <w:rPr>
+          <w:rFonts w:cs="Times New Roman"/>
+        </w:rPr>
+      </w:pPr>
+    </w:p>
+    <w:p>
+      <w:pPr>
+        <w:spacing w:after="151"/>
+        <w:ind w:right="14"/>
+        <w:jc w:val="center"/>
+        <w:rPr>
+          <w:rFonts w:cs="Times New Roman"/>
+        </w:rPr>
+      </w:pPr>
+    </w:p>
+    <w:p>
+      <w:pPr>
+        <w:spacing w:after="146"/>
+        <w:ind w:left="10" w:right="72" w:hanging="10"/>
+        <w:jc w:val="center"/>
+        <w:rPr>
+          <w:rFonts w:cs="Times New Roman"/>
+          <w:sz w:val="28"/>
+          <w:szCs w:val="28"/>
+        </w:rPr>
+      </w:pPr>
+      <w:r>
+        <w:rPr>
+          <w:rFonts w:cs="Times New Roman"/>
+          <w:sz w:val="28"/>
+          <w:szCs w:val="28"/>
+        </w:rPr>
+        <w:t xml:space="preserve">Lab Report No. </w:t>
+      </w:r>
+      <w:r>
+        <w:rPr>
+          <w:rFonts w:cs="Times New Roman"/>
+          <w:sz w:val="28"/>
+          <w:szCs w:val="28"/>
+        </w:rPr>
+        <w:t>8</w:t>
+      </w:r>
+    </w:p>
+    <w:p>
+      <w:pPr>
+        <w:spacing w:after="146"/>
+        <w:ind w:left="10" w:right="72" w:hanging="10"/>
+        <w:jc w:val="center"/>
+        <w:rPr>
+          <w:rFonts w:cs="Times New Roman"/>
+          <w:b/>
+          <w:bCs/>
+          <w:sz w:val="28"/>
+          <w:szCs w:val="28"/>
+        </w:rPr>
+      </w:pPr>
+      <w:r>
+        <w:rPr>
+          <w:rFonts w:cs="Times New Roman"/>
+          <w:b/>
+          <w:bCs/>
+          <w:sz w:val="28"/>
+          <w:szCs w:val="28"/>
+        </w:rPr>
+        <w:t>Programming with Python</w:t>
+      </w:r>
+    </w:p>
+    <w:p>
+      <w:pPr>
+        <w:spacing w:after="146"/>
+        <w:ind w:left="10" w:right="72" w:hanging="10"/>
+        <w:jc w:val="center"/>
+        <w:rPr>
+          <w:rFonts w:cs="Times New Roman"/>
+          <w:b/>
+          <w:bCs/>
+          <w:sz w:val="28"/>
+          <w:szCs w:val="28"/>
+        </w:rPr>
+      </w:pPr>
+    </w:p>
+    <w:p>
+      <w:pPr>
+        <w:spacing w:after="149"/>
+        <w:rPr>
+          <w:rFonts w:cs="Times New Roman"/>
+        </w:rPr>
+      </w:pPr>
+    </w:p>
+    <w:p>
+      <w:pPr>
+        <w:spacing w:after="139"/>
+        <w:ind w:left="-5" w:hanging="10"/>
+        <w:rPr>
+          <w:rFonts w:cs="Times New Roman"/>
+          <w:sz w:val="28"/>
+          <w:szCs w:val="28"/>
+        </w:rPr>
+      </w:pPr>
+      <w:r>
+        <w:rPr>
+          <w:rFonts w:cs="Times New Roman"/>
+          <w:b/>
+          <w:bCs/>
+          <w:sz w:val="28"/>
+          <w:szCs w:val="28"/>
+        </w:rPr>
+        <w:t>Submitted by</w:t>
+      </w:r>
+      <w:r>
+        <w:rPr>
+          <w:rFonts w:cs="Times New Roman"/>
+          <w:sz w:val="28"/>
+          <w:szCs w:val="28"/>
+        </w:rPr>
+        <w:t xml:space="preserve">: </w:t>
+      </w:r>
+      <w:r>
+        <w:rPr>
+          <w:rFonts w:cs="Times New Roman"/>
+          <w:sz w:val="28"/>
+          <w:szCs w:val="28"/>
+        </w:rPr>
+        <w:tab/>
+      </w:r>
+      <w:r>
+        <w:rPr>
+          <w:rFonts w:cs="Times New Roman"/>
+          <w:sz w:val="28"/>
+          <w:szCs w:val="28"/>
+        </w:rPr>
+        <w:tab/>
+      </w:r>
+      <w:r>
+        <w:rPr>
+          <w:rFonts w:cs="Times New Roman"/>
+          <w:sz w:val="28"/>
+          <w:szCs w:val="28"/>
+        </w:rPr>
+        <w:tab/>
+      </w:r>
+      <w:r>
+        <w:rPr>
+          <w:rFonts w:cs="Times New Roman"/>
+          <w:sz w:val="28"/>
+          <w:szCs w:val="28"/>
+        </w:rPr>
+        <w:tab/>
+      </w:r>
+      <w:r>
+        <w:rPr>
+          <w:rFonts w:cs="Times New Roman"/>
+          <w:sz w:val="28"/>
+          <w:szCs w:val="28"/>
+        </w:rPr>
+        <w:tab/>
+      </w:r>
+      <w:r>
+        <w:rPr>
+          <w:rFonts w:cs="Times New Roman"/>
+          <w:sz w:val="28"/>
+          <w:szCs w:val="28"/>
+        </w:rPr>
+        <w:tab/>
+      </w:r>
+      <w:r>
+        <w:rPr>
+          <w:rFonts w:cs="Times New Roman"/>
+          <w:b/>
+          <w:bCs/>
+          <w:sz w:val="28"/>
+          <w:szCs w:val="28"/>
+        </w:rPr>
+        <w:t xml:space="preserve">   Submitted to:</w:t>
+      </w:r>
+    </w:p>
+    <w:p>
+      <w:pPr>
+        <w:spacing w:after="139"/>
+        <w:ind w:left="-5" w:hanging="10"/>
+        <w:rPr>
+          <w:rFonts w:cs="Times New Roman"/>
+          <w:sz w:val="28"/>
+          <w:szCs w:val="28"/>
+        </w:rPr>
+      </w:pPr>
+      <w:r>
+        <w:rPr>
+          <w:rFonts w:cs="Times New Roman"/>
+          <w:sz w:val="28"/>
+          <w:szCs w:val="28"/>
+        </w:rPr>
+        <w:t xml:space="preserve">Name: Siddhartha Shakya                              </w:t>
+      </w:r>
+      <w:r>
+        <w:rPr>
+          <w:rFonts w:cs="Times New Roman"/>
+          <w:sz w:val="28"/>
+          <w:szCs w:val="28"/>
+        </w:rPr>
+        <w:tab/>
+      </w:r>
+      <w:r>
+        <w:rPr>
+          <w:rFonts w:cs="Times New Roman"/>
+          <w:sz w:val="28"/>
+          <w:szCs w:val="28"/>
+        </w:rPr>
+        <w:tab/>
+        <w:t xml:space="preserve">  </w:t>
+      </w:r>
+      <w:r>
+        <w:rPr>
+          <w:rFonts w:cs="Times New Roman"/>
+          <w:sz w:val="28"/>
+          <w:szCs w:val="28"/>
+        </w:rPr>
+        <w:t xml:space="preserve"> Sumit </w:t>
+      </w:r>
+      <w:proofErr w:type="spellStart"/>
+      <w:r>
+        <w:rPr>
+          <w:rFonts w:cs="Times New Roman"/>
+          <w:sz w:val="28"/>
+          <w:szCs w:val="28"/>
+        </w:rPr>
+        <w:t>Ghising</w:t>
+      </w:r>
+      <w:proofErr w:type="spellEnd"/>
+      <w:r>
+        <w:rPr>
+          <w:rFonts w:cs="Times New Roman"/>
+          <w:sz w:val="28"/>
+          <w:szCs w:val="28"/>
+        </w:rPr>
+        <w:tab/>
+        <w:t xml:space="preserve">  </w:t>
+      </w:r>
+    </w:p>
+    <w:p>
+      <w:pPr>
+        <w:spacing w:after="187"/>
+        <w:ind w:left="-5" w:hanging="10"/>
+        <w:rPr>
+          <w:rFonts w:cs="Times New Roman"/>
+          <w:sz w:val="28"/>
+          <w:szCs w:val="28"/>
+        </w:rPr>
+      </w:pPr>
+      <w:r>
+        <w:rPr>
+          <w:rFonts w:cs="Times New Roman"/>
+          <w:sz w:val="28"/>
+          <w:szCs w:val="28"/>
+        </w:rPr>
+        <w:t>Program: BIM</w:t>
+      </w:r>
+      <w:r>
+        <w:rPr>
+          <w:rFonts w:cs="Times New Roman"/>
+          <w:sz w:val="28"/>
+          <w:szCs w:val="28"/>
+        </w:rPr>
+        <w:tab/>
+        <w:t xml:space="preserve">            </w:t>
+      </w:r>
+      <w:r>
+        <w:rPr>
+          <w:rFonts w:cs="Times New Roman"/>
+          <w:sz w:val="28"/>
+          <w:szCs w:val="28"/>
+        </w:rPr>
+        <w:tab/>
+      </w:r>
+      <w:r>
+        <w:rPr>
+          <w:rFonts w:cs="Times New Roman"/>
+          <w:sz w:val="28"/>
+          <w:szCs w:val="28"/>
+        </w:rPr>
+        <w:tab/>
+      </w:r>
+      <w:r>
+        <w:rPr>
+          <w:rFonts w:cs="Times New Roman"/>
+          <w:sz w:val="28"/>
+          <w:szCs w:val="28"/>
+        </w:rPr>
+        <w:tab/>
+      </w:r>
+      <w:r>
+        <w:rPr>
+          <w:rFonts w:cs="Times New Roman"/>
+          <w:sz w:val="28"/>
+          <w:szCs w:val="28"/>
+        </w:rPr>
+        <w:tab/>
+        <w:t xml:space="preserve">   </w:t>
+      </w:r>
+    </w:p>
+    <w:p>
+      <w:pPr>
+        <w:spacing w:after="187"/>
+        <w:ind w:left="-5" w:hanging="10"/>
+        <w:rPr>
+          <w:rFonts w:cs="Times New Roman"/>
+          <w:sz w:val="28"/>
+          <w:szCs w:val="28"/>
+        </w:rPr>
+      </w:pPr>
+      <w:r>
+        <w:rPr>
+          <w:rFonts w:cs="Times New Roman"/>
+          <w:sz w:val="28"/>
+          <w:szCs w:val="28"/>
+        </w:rPr>
+        <w:t xml:space="preserve">Roll no: </w:t>
+      </w:r>
+      <w:r>
+        <w:rPr>
+          <w:rFonts w:cs="Times New Roman"/>
+          <w:sz w:val="28"/>
+          <w:szCs w:val="28"/>
+        </w:rPr>
+        <w:t>18</w:t>
+      </w:r>
+      <w:r>
+        <w:rPr>
+          <w:rFonts w:cs="Times New Roman"/>
+          <w:sz w:val="28"/>
+          <w:szCs w:val="28"/>
+        </w:rPr>
+        <w:tab/>
+      </w:r>
+      <w:r>
+        <w:rPr>
+          <w:rFonts w:cs="Times New Roman"/>
+          <w:sz w:val="28"/>
+          <w:szCs w:val="28"/>
+        </w:rPr>
+        <w:tab/>
+      </w:r>
+      <w:r>
+        <w:rPr>
+          <w:rFonts w:cs="Times New Roman"/>
+          <w:sz w:val="28"/>
+          <w:szCs w:val="28"/>
+        </w:rPr>
+        <w:tab/>
+      </w:r>
+      <w:r>
+        <w:rPr>
+          <w:rFonts w:cs="Times New Roman"/>
+          <w:sz w:val="28"/>
+          <w:szCs w:val="28"/>
+        </w:rPr>
+        <w:tab/>
+        <w:t xml:space="preserve">             </w:t>
+      </w:r>
+    </w:p>
+    <w:p>
+      <w:pPr>
+        <w:tabs>
+          <w:tab w:val="left" w:pos="6348"/>
+        </w:tabs>
+        <w:spacing w:after="171"/>
+        <w:ind w:left="-5" w:hanging="10"/>
+        <w:rPr>
+          <w:rFonts w:cs="Times New Roman"/>
+          <w:sz w:val="28"/>
+          <w:szCs w:val="28"/>
+        </w:rPr>
+      </w:pPr>
+      <w:r>
+        <w:rPr>
+          <w:rFonts w:cs="Times New Roman"/>
+          <w:sz w:val="28"/>
+          <w:szCs w:val="28"/>
+        </w:rPr>
+        <w:t xml:space="preserve">Section: B </w:t>
+      </w:r>
+      <w:r>
+        <w:rPr>
+          <w:rFonts w:cs="Times New Roman"/>
+          <w:sz w:val="28"/>
+          <w:szCs w:val="28"/>
+        </w:rPr>
+        <w:tab/>
+      </w:r>
+    </w:p>
+    <w:p>
+      <w:pPr>
+        <w:tabs>
+          <w:tab w:val="center" w:pos="2707"/>
+          <w:tab w:val="center" w:pos="3384"/>
+          <w:tab w:val="center" w:pos="4061"/>
+        </w:tabs>
+        <w:spacing w:after="139"/>
+        <w:ind w:left="-15"/>
+        <w:rPr>
+          <w:rFonts w:cs="Times New Roman"/>
+          <w:sz w:val="28"/>
+          <w:szCs w:val="28"/>
+        </w:rPr>
+      </w:pPr>
+      <w:r>
+        <w:rPr>
+          <w:rFonts w:cs="Times New Roman"/>
+          <w:sz w:val="28"/>
+          <w:szCs w:val="28"/>
+        </w:rPr>
+        <w:tab/>
+      </w:r>
+      <w:r>
+        <w:rPr>
+          <w:rFonts w:cs="Times New Roman"/>
+          <w:sz w:val="28"/>
+          <w:szCs w:val="28"/>
+        </w:rPr>
+        <w:tab/>
+      </w:r>
+      <w:r>
+        <w:rPr>
+          <w:rFonts w:cs="Times New Roman"/>
+          <w:sz w:val="28"/>
+          <w:szCs w:val="28"/>
+        </w:rPr>
+        <w:tab/>
+      </w:r>
+    </w:p>
+    <w:p>
+      <w:pPr>
+        <w:spacing w:line="259" w:lineRule="auto"/>
+        <w:rPr>
+          <w:sz w:val="28"/>
+          <w:szCs w:val="28"/>
+        </w:rPr>
+      </w:pPr>
+      <w:r>
+        <w:rPr>
+          <w:noProof/>
+          <w:sz w:val="28"/>
+          <w:szCs w:val="28"/>
+        </w:rPr>
+        <mc:AlternateContent>
+          <mc:Choice Requires="wps">
+            <w:drawing>
+              <wp:anchor distT="0" distB="0" distL="114300" distR="114300" simplePos="0" relativeHeight="251665408" behindDoc="0" locked="0" layoutInCell="1" allowOverlap="1" wp14:anchorId="159144A1" wp14:editId="0102A497">
+                <wp:simplePos x="0" y="0"/>
+                <wp:positionH relativeFrom="margin">
+                  <wp:posOffset>1677907</wp:posOffset>
+                </wp:positionH>
+                <wp:positionV relativeFrom="paragraph">
+                  <wp:posOffset>228653</wp:posOffset>
+                </wp:positionV>
+                <wp:extent cx="2231756" cy="410705"/>
+                <wp:effectExtent l="0" t="0" r="3810" b="0"/>
+                <wp:wrapNone/>
+                <wp:docPr id="1916179809" name="Text Box 1916179809"/>
+                <wp:cNvGraphicFramePr/>
+                <a:graphic xmlns:a="http://schemas.openxmlformats.org/drawingml/2006/main">
+                  <a:graphicData uri="http://schemas.microsoft.com/office/word/2010/wordprocessingShape">
+                    <wps:wsp>
+                      <wps:cNvSpPr txBox="1"/>
+                      <wps:spPr>
+                        <a:xfrm>
+                          <a:off x="0" y="0"/>
+                          <a:ext cx="2231756" cy="410705"/>
+                        </a:xfrm>
+                        <a:prstGeom prst="rect">
+                          <a:avLst/>
+                        </a:prstGeom>
+                        <a:solidFill>
+                          <a:schemeClr val="lt1"/>
+                        </a:solidFill>
+                        <a:ln w="6350">
+                          <a:noFill/>
+                        </a:ln>
+                      </wps:spPr>
+                      <wps:txbx>
+                        <w:txbxContent>
+                          <w:p>
+                            <w:pPr>
+                              <w:jc w:val="center"/>
+                            </w:pPr>
+                            <w:r>
+                              <w:rPr>
+                                <w:b/>
+                                <w:bCs/>
+                              </w:rPr>
+                              <w:t>Date of submission:</w:t>
+                            </w:r>
+                            <w:r>
+                              <w:t xml:space="preserve"> </w:t>
+                            </w:r>
+                          </w:p>
+                        </w:txbxContent>
+                      </wps:txbx>
+                      <wps:bodyPr rot="0" spcFirstLastPara="0" vertOverflow="overflow" horzOverflow="overflow" vert="horz" wrap="square" lIns="91440" tIns="45720" rIns="91440" bIns="45720" numCol="1" spcCol="0" rtlCol="0" fromWordArt="0" anchor="t" anchorCtr="0" forceAA="0" compatLnSpc="1">
+                        <a:prstTxWarp prst="textNoShape">
+                          <a:avLst/>
+                        </a:prstTxWarp>
+                        <a:noAutofit/>
+                      </wps:bodyPr>
+                    </wps:wsp>
+                  </a:graphicData>
+                </a:graphic>
+              </wp:anchor>
+            </w:drawing>
+          </mc:Choice>
+          <mc:Fallback>
+            <w:pict>
+              <v:shape w14:anchorId="159144A1" id="Text Box 1916179809" o:spid="_x0000_s1029" type="#_x0000_t202" style="position:absolute;margin-left:132.1pt;margin-top:18pt;width:175.75pt;height:32.35pt;z-index:251665408;visibility:visible;mso-wrap-style:square;mso-wrap-distance-left:9pt;mso-wrap-distance-top:0;mso-wrap-distance-right:9pt;mso-wrap-distance-bottom:0;mso-position-horizontal:absolute;mso-position-horizontal-relative:margin;mso-position-vertical:absolute;mso-position-vertical-relative:text;v-text-anchor:top" o:gfxdata="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" fillcolor="white [3201]" stroked="f" strokeweight=".5pt">
+                <v:textbox>
+                  <w:txbxContent>
+                    <w:p>
+                      <w:pPr>
+                        <w:jc w:val="center"/>
+                      </w:pPr>
+                      <w:r>
+                        <w:rPr>
+                          <w:b/>
+                          <w:bCs/>
+                        </w:rPr>
+                        <w:t>Date of submission:</w:t>
+                      </w:r>
+                      <w:r>
+                        <w:t xml:space="preserve"> </w:t>
+                      </w:r>
+                    </w:p>
+                  </w:txbxContent>
+                </v:textbox>
+                <w10:wrap anchorx="margin"/>
+              </v:shape>
+            </w:pict>
+          </mc:Fallback>
+        </mc:AlternateContent>
+      </w:r>
+    </w:p>
+    <w:p/>
+    <w:p>
+      <w:pPr>
+        <w:spacing w:after="160" w:line="278" w:lineRule="auto"/>
+      </w:pPr>
+      <w:r>
+        <w:br w:type="page"/>
+      </w:r>
+    </w:p>
+    <w:p/>
+    <w:p>
+      <w:pPr>
+        <w:spacing w:after="160" w:line="278" w:lineRule="auto"/>
+      </w:pPr>
+      <w:r>
+        <w:rPr>
+          <w:noProof/>
+          <w14:ligatures w14:val="standardContextual"/>
+        </w:rPr>
+        <w:drawing>
+          <wp:anchor distT="0" distB="0" distL="114300" distR="114300" simplePos="0" relativeHeight="251666432" behindDoc="0" locked="0" layoutInCell="1" allowOverlap="1" wp14:anchorId="34021962" wp14:editId="583C3DCC">
+            <wp:simplePos x="0" y="0"/>
+            <wp:positionH relativeFrom="column">
+              <wp:posOffset>7620</wp:posOffset>
+            </wp:positionH>
+            <wp:positionV relativeFrom="paragraph">
+              <wp:posOffset>4533900</wp:posOffset>
+            </wp:positionV>
+            <wp:extent cx="5731510" cy="4533265"/>
+            <wp:effectExtent l="0" t="0" r="2540" b="635"/>
+            <wp:wrapNone/>
+            <wp:docPr id="673319512" name="Picture 17"/>
+            <wp:cNvGraphicFramePr>
+              <a:graphicFrameLocks xmlns:a="http://schemas.openxmlformats.org/drawingml/2006/main" noChangeAspect="1"/>
+            </wp:cNvGraphicFramePr>
+            <a:graphic xmlns:a="http://schemas.openxmlformats.org/drawingml/2006/main">
+              <a:graphicData uri="http://schemas.openxmlformats.org/drawingml/2006/picture">
+                <pic:pic xmlns:pic="http://schemas.openxmlformats.org/drawingml/2006/picture">
+                  <pic:nvPicPr>
+                    <pic:cNvPr id="673319512" name="Picture 673319512"/>
+                    <pic:cNvPicPr/>
+                  </pic:nvPicPr>
+                  <pic:blipFill>
+                    <a:blip r:embed="rId4">
+                      <a:extLst>
+                        <a:ext uri="{28A0092B-C50C-407E-A947-70E740481C1C}">
+                          <a14:useLocalDpi xmlns:a14="http://schemas.microsoft.com/office/drawing/2010/main" val="0"/>
+                        </a:ext>
+                      </a:extLst>
+                    </a:blip>
+                    <a:stretch>
+                      <a:fillRect/>
+                    </a:stretch>
+                  </pic:blipFill>
+                  <pic:spPr>
+                    <a:xfrm>
+                      <a:off x="0" y="0"/>
+                      <a:ext cx="5731510" cy="4533265"/>
+                    </a:xfrm>
+                    <a:prstGeom prst="rect">
+                      <a:avLst/>
+                    </a:prstGeom>
+                  </pic:spPr>
+                </pic:pic>
+              </a:graphicData>
+            </a:graphic>
+            <wp14:sizeRelH relativeFrom="page">
+              <wp14:pctWidth>0</wp14:pctWidth>
+            </wp14:sizeRelH>
+            <wp14:sizeRelV relativeFrom="page">
+              <wp14:pctHeight>0</wp14:pctHeight>
+            </wp14:sizeRelV>
+          </wp:anchor>
+        </w:drawing>
+      </w:r>
+      <w:r>
+        <w:rPr>
+          <w:noProof/>
+          <w14:ligatures w14:val="standardContextual"/>
+        </w:rPr>
+        <w:drawing>
+          <wp:anchor distT="0" distB="0" distL="114300" distR="114300" simplePos="0" relativeHeight="251667456" behindDoc="0" locked="0" layoutInCell="1" allowOverlap="1" wp14:anchorId="75CD6098" wp14:editId="2DAB8A40">
+            <wp:simplePos x="0" y="0"/>
+            <wp:positionH relativeFrom="column">
+              <wp:posOffset>0</wp:posOffset>
+            </wp:positionH>
+            <wp:positionV relativeFrom="paragraph">
+              <wp:posOffset>0</wp:posOffset>
+            </wp:positionV>
+            <wp:extent cx="5731510" cy="4316095"/>
+            <wp:effectExtent l="0" t="0" r="2540" b="8255"/>
+            <wp:wrapNone/>
+            <wp:docPr id="1392244620" name="Picture 18"/>
+            <wp:cNvGraphicFramePr>
+              <a:graphicFrameLocks xmlns:a="http://schemas.openxmlformats.org/drawingml/2006/main" noChangeAspect="1"/>
+            </wp:cNvGraphicFramePr>
+            <a:graphic xmlns:a="http://schemas.openxmlformats.org/drawingml/2006/main">
+              <a:graphicData uri="http://schemas.openxmlformats.org/drawingml/2006/picture">
+                <pic:pic xmlns:pic="http://schemas.openxmlformats.org/drawingml/2006/picture">
+                  <pic:nvPicPr>
+                    <pic:cNvPr id="1392244620" name="Picture 1392244620"/>
+                    <pic:cNvPicPr/>
+                  </pic:nvPicPr>
+                  <pic:blipFill>
+                    <a:blip r:embed="rId5">
+                      <a:extLst>
+                        <a:ext uri="{28A0092B-C50C-407E-A947-70E740481C1C}">
+                          <a14:useLocalDpi xmlns:a14="http://schemas.microsoft.com/office/drawing/2010/main" val="0"/>
+                        </a:ext>
+                      </a:extLst>
+                    </a:blip>
+                    <a:stretch>
+                      <a:fillRect/>
+                    </a:stretch>
+                  </pic:blipFill>
+                  <pic:spPr>
+                    <a:xfrm>
+                      <a:off x="0" y="0"/>
+                      <a:ext cx="5731510" cy="4316095"/>
+                    </a:xfrm>
+                    <a:prstGeom prst="rect">
+                      <a:avLst/>
+                    </a:prstGeom>
+                  </pic:spPr>
+                </pic:pic>
+              </a:graphicData>
+            </a:graphic>
+            <wp14:sizeRelH relativeFrom="page">
+              <wp14:pctWidth>0</wp14:pctWidth>
+            </wp14:sizeRelH>
+            <wp14:sizeRelV relativeFrom="page">
+              <wp14:pctHeight>0</wp14:pctHeight>
+            </wp14:sizeRelV>
+          </wp:anchor>
+        </w:drawing>
+      </w:r>
+      <w:r>
+        <w:br w:type="page"/>
+      </w:r>
+    </w:p>
+    <w:p>
+      <w:r>
+        <w:rPr>
+          <w:noProof/>
+          <w14:ligatures w14:val="standardContextual"/>
+        </w:rPr>
+        <w:lastRenderedPageBreak/>
+        <w:drawing>
+          <wp:anchor distT="0" distB="0" distL="114300" distR="114300" simplePos="0" relativeHeight="251670528" behindDoc="0" locked="0" layoutInCell="1" allowOverlap="1" wp14:anchorId="7CED482C" wp14:editId="51C64C5C">
+            <wp:simplePos x="0" y="0"/>
+            <wp:positionH relativeFrom="column">
+              <wp:posOffset>-281940</wp:posOffset>
+            </wp:positionH>
+            <wp:positionV relativeFrom="paragraph">
+              <wp:posOffset>5204460</wp:posOffset>
+            </wp:positionV>
+            <wp:extent cx="5128260" cy="1569720"/>
+            <wp:effectExtent l="0" t="0" r="0" b="0"/>
+            <wp:wrapNone/>
+            <wp:docPr id="521655321" name="Picture 19"/>
+            <wp:cNvGraphicFramePr>
+              <a:graphicFrameLocks xmlns:a="http://schemas.openxmlformats.org/drawingml/2006/main" noChangeAspect="1"/>
+            </wp:cNvGraphicFramePr>
+            <a:graphic xmlns:a="http://schemas.openxmlformats.org/drawingml/2006/main">
+              <a:graphicData uri="http://schemas.openxmlformats.org/drawingml/2006/picture">
+                <pic:pic xmlns:pic="http://schemas.openxmlformats.org/drawingml/2006/picture">
+                  <pic:nvPicPr>
+                    <pic:cNvPr id="521655321" name="Picture 521655321"/>
+                    <pic:cNvPicPr/>
+                  </pic:nvPicPr>
+                  <pic:blipFill>
+                    <a:blip r:embed="rId6">
+                      <a:extLst>
+                        <a:ext uri="{28A0092B-C50C-407E-A947-70E740481C1C}">
+                          <a14:useLocalDpi xmlns:a14="http://schemas.microsoft.com/office/drawing/2010/main" val="0"/>
+                        </a:ext>
+                      </a:extLst>
+                    </a:blip>
+                    <a:stretch>
+                      <a:fillRect/>
+                    </a:stretch>
+                  </pic:blipFill>
+                  <pic:spPr>
+                    <a:xfrm>
+                      <a:off x="0" y="0"/>
+                      <a:ext cx="5128260" cy="1569720"/>
+                    </a:xfrm>
+                    <a:prstGeom prst="rect">
+                      <a:avLst/>
+                    </a:prstGeom>
+                  </pic:spPr>
+                </pic:pic>
+              </a:graphicData>
+            </a:graphic>
+            <wp14:sizeRelH relativeFrom="page">
+              <wp14:pctWidth>0</wp14:pctWidth>
+            </wp14:sizeRelH>
+            <wp14:sizeRelV relativeFrom="page">
+              <wp14:pctHeight>0</wp14:pctHeight>
+            </wp14:sizeRelV>
+          </wp:anchor>
+        </w:drawing>
+      </w:r>
+      <w:r>
+        <w:rPr>
+          <w:noProof/>
+          <w14:ligatures w14:val="standardContextual"/>
+        </w:rPr>
+        <w:drawing>
+          <wp:anchor distT="0" distB="0" distL="114300" distR="114300" simplePos="0" relativeHeight="251668480" behindDoc="0" locked="0" layoutInCell="1" allowOverlap="1" wp14:anchorId="515714B9" wp14:editId="64E04002">
+            <wp:simplePos x="0" y="0"/>
+            <wp:positionH relativeFrom="margin">
+              <wp:posOffset>-555625</wp:posOffset>
+            </wp:positionH>
+            <wp:positionV relativeFrom="paragraph">
+              <wp:posOffset>-106680</wp:posOffset>
+            </wp:positionV>
+            <wp:extent cx="3909060" cy="4587875"/>
+            <wp:effectExtent l="0" t="0" r="0" b="3175"/>
+            <wp:wrapNone/>
+            <wp:docPr id="1925904299" name="Picture 17"/>
+            <wp:cNvGraphicFramePr>
+              <a:graphicFrameLocks xmlns:a="http://schemas.openxmlformats.org/drawingml/2006/main" noChangeAspect="1"/>
+            </wp:cNvGraphicFramePr>
+            <a:graphic xmlns:a="http://schemas.openxmlformats.org/drawingml/2006/main">
+              <a:graphicData uri="http://schemas.openxmlformats.org/drawingml/2006/picture">
+                <pic:pic xmlns:pic="http://schemas.openxmlformats.org/drawingml/2006/picture">
+                  <pic:nvPicPr>
+                    <pic:cNvPr id="1925904299" name="Picture 1925904299"/>
+                    <pic:cNvPicPr/>
+                  </pic:nvPicPr>
+                  <pic:blipFill>
+                    <a:blip r:embed="rId7">
+                      <a:extLst>
+                        <a:ext uri="{28A0092B-C50C-407E-A947-70E740481C1C}">
+                          <a14:useLocalDpi xmlns:a14="http://schemas.microsoft.com/office/drawing/2010/main" val="0"/>
+                        </a:ext>
+                      </a:extLst>
+                    </a:blip>
+                    <a:stretch>
+                      <a:fillRect/>
+                    </a:stretch>
+                  </pic:blipFill>
+                  <pic:spPr>
+                    <a:xfrm>
+                      <a:off x="0" y="0"/>
+                      <a:ext cx="3909060" cy="4587875"/>
+                    </a:xfrm>
+                    <a:prstGeom prst="rect">
+                      <a:avLst/>
+                    </a:prstGeom>
+                  </pic:spPr>
+                </pic:pic>
+              </a:graphicData>
+            </a:graphic>
+            <wp14:sizeRelH relativeFrom="page">
+              <wp14:pctWidth>0</wp14:pctWidth>
+            </wp14:sizeRelH>
+            <wp14:sizeRelV relativeFrom="page">
+              <wp14:pctHeight>0</wp14:pctHeight>
+            </wp14:sizeRelV>
+          </wp:anchor>
+        </w:drawing>
+      </w:r>
+      <w:r>
+        <w:rPr>
+          <w:noProof/>
+          <w14:ligatures w14:val="standardContextual"/>
+        </w:rPr>
+        <w:drawing>
+          <wp:anchor distT="0" distB="0" distL="114300" distR="114300" simplePos="0" relativeHeight="251669504" behindDoc="0" locked="0" layoutInCell="1" allowOverlap="1" wp14:anchorId="4EA3175D" wp14:editId="2031B234">
+            <wp:simplePos x="0" y="0"/>
+            <wp:positionH relativeFrom="column">
+              <wp:posOffset>3421380</wp:posOffset>
+            </wp:positionH>
+            <wp:positionV relativeFrom="paragraph">
+              <wp:posOffset>-91440</wp:posOffset>
+            </wp:positionV>
+            <wp:extent cx="3009900" cy="5044440"/>
+            <wp:effectExtent l="0" t="0" r="0" b="3810"/>
+            <wp:wrapNone/>
+            <wp:docPr id="1661491150" name="Picture 18"/>
+            <wp:cNvGraphicFramePr>
+              <a:graphicFrameLocks xmlns:a="http://schemas.openxmlformats.org/drawingml/2006/main" noChangeAspect="1"/>
+            </wp:cNvGraphicFramePr>
+            <a:graphic xmlns:a="http://schemas.openxmlformats.org/drawingml/2006/main">
+              <a:graphicData uri="http://schemas.openxmlformats.org/drawingml/2006/picture">
+                <pic:pic xmlns:pic="http://schemas.openxmlformats.org/drawingml/2006/picture">
+                  <pic:nvPicPr>
+                    <pic:cNvPr id="1661491150" name="Picture 1661491150"/>
+                    <pic:cNvPicPr/>
+                  </pic:nvPicPr>
+                  <pic:blipFill>
+                    <a:blip r:embed="rId8">
+                      <a:extLst>
+                        <a:ext uri="{28A0092B-C50C-407E-A947-70E740481C1C}">
+                          <a14:useLocalDpi xmlns:a14="http://schemas.microsoft.com/office/drawing/2010/main" val="0"/>
+                        </a:ext>
+                      </a:extLst>
+                    </a:blip>
+                    <a:stretch>
+                      <a:fillRect/>
+                    </a:stretch>
+                  </pic:blipFill>
+                  <pic:spPr>
+                    <a:xfrm>
+                      <a:off x="0" y="0"/>
+                      <a:ext cx="3009900" cy="5044440"/>
+                    </a:xfrm>
+                    <a:prstGeom prst="rect">
+                      <a:avLst/>
+                    </a:prstGeom>
+                  </pic:spPr>
+                </pic:pic>
+              </a:graphicData>
+            </a:graphic>
+            <wp14:sizeRelH relativeFrom="page">
+              <wp14:pctWidth>0</wp14:pctWidth>
+            </wp14:sizeRelH>
+            <wp14:sizeRelV relativeFrom="page">
+              <wp14:pctHeight>0</wp14:pctHeight>
+            </wp14:sizeRelV>
+          </wp:anchor>
+        </w:drawing>
+      </w:r>
     </w:p>
     <w:sectPr>
       <w:pgSz w:w="11906" w:h="16838" w:code="9"/>
@@ -1402,7 +4409,7 @@
       <w:kern w:val="2"/>
       <w:sz w:val="40"/>
       <w:szCs w:val="40"/>
-      <w:lang w:val="en-US" w:bidi="ar-SA"/>
+      <w:lang w:bidi="ar-SA"/>
       <w14:ligatures w14:val="standardContextual"/>
     </w:rPr>
   </w:style>
@@ -1428,7 +4435,7 @@
       <w:kern w:val="2"/>
       <w:sz w:val="32"/>
       <w:szCs w:val="32"/>
-      <w:lang w:val="en-US" w:bidi="ar-SA"/>
+      <w:lang w:bidi="ar-SA"/>
       <w14:ligatures w14:val="standardContextual"/>
     </w:rPr>
   </w:style>
@@ -1454,7 +4461,7 @@
       <w:kern w:val="2"/>
       <w:sz w:val="28"/>
       <w:szCs w:val="28"/>
-      <w:lang w:val="en-US" w:bidi="ar-SA"/>
+      <w:lang w:bidi="ar-SA"/>
       <w14:ligatures w14:val="standardContextual"/>
     </w:rPr>
   </w:style>
@@ -1481,7 +4488,7 @@
       <w:color w:val="0F4761" w:themeColor="accent1" w:themeShade="BF"/>
       <w:kern w:val="2"/>
       <w:szCs w:val="24"/>
-      <w:lang w:val="en-US" w:bidi="ar-SA"/>
+      <w:lang w:bidi="ar-SA"/>
       <w14:ligatures w14:val="standardContextual"/>
     </w:rPr>
   </w:style>
@@ -1506,7 +4513,7 @@
       <w:color w:val="0F4761" w:themeColor="accent1" w:themeShade="BF"/>
       <w:kern w:val="2"/>
       <w:szCs w:val="24"/>
-      <w:lang w:val="en-US" w:bidi="ar-SA"/>
+      <w:lang w:bidi="ar-SA"/>
       <w14:ligatures w14:val="standardContextual"/>
     </w:rPr>
   </w:style>
@@ -1533,7 +4540,7 @@
       <w:color w:val="595959" w:themeColor="text1" w:themeTint="A6"/>
       <w:kern w:val="2"/>
       <w:szCs w:val="24"/>
-      <w:lang w:val="en-US" w:bidi="ar-SA"/>
+      <w:lang w:bidi="ar-SA"/>
       <w14:ligatures w14:val="standardContextual"/>
     </w:rPr>
   </w:style>
@@ -1558,7 +4565,7 @@
       <w:color w:val="595959" w:themeColor="text1" w:themeTint="A6"/>
       <w:kern w:val="2"/>
       <w:szCs w:val="24"/>
-      <w:lang w:val="en-US" w:bidi="ar-SA"/>
+      <w:lang w:bidi="ar-SA"/>
       <w14:ligatures w14:val="standardContextual"/>
     </w:rPr>
   </w:style>
@@ -1585,7 +4592,7 @@
       <w:color w:val="272727" w:themeColor="text1" w:themeTint="D8"/>
       <w:kern w:val="2"/>
       <w:szCs w:val="24"/>
-      <w:lang w:val="en-US" w:bidi="ar-SA"/>
+      <w:lang w:bidi="ar-SA"/>
       <w14:ligatures w14:val="standardContextual"/>
     </w:rPr>
   </w:style>
@@ -1610,7 +4617,7 @@
       <w:color w:val="272727" w:themeColor="text1" w:themeTint="D8"/>
       <w:kern w:val="2"/>
       <w:szCs w:val="24"/>
-      <w:lang w:val="en-US" w:bidi="ar-SA"/>
+      <w:lang w:bidi="ar-SA"/>
       <w14:ligatures w14:val="standardContextual"/>
     </w:rPr>
   </w:style>
@@ -1778,7 +4785,7 @@
       <w:kern w:val="28"/>
       <w:sz w:val="56"/>
       <w:szCs w:val="56"/>
-      <w:lang w:val="en-US" w:bidi="ar-SA"/>
+      <w:lang w:bidi="ar-SA"/>
       <w14:ligatures w14:val="standardContextual"/>
     </w:rPr>
   </w:style>
@@ -1817,7 +4824,7 @@
       <w:kern w:val="2"/>
       <w:sz w:val="28"/>
       <w:szCs w:val="28"/>
-      <w:lang w:val="en-US" w:bidi="ar-SA"/>
+      <w:lang w:bidi="ar-SA"/>
       <w14:ligatures w14:val="standardContextual"/>
     </w:rPr>
   </w:style>
@@ -1854,7 +4861,7 @@
       <w:color w:val="404040" w:themeColor="text1" w:themeTint="BF"/>
       <w:kern w:val="2"/>
       <w:szCs w:val="24"/>
-      <w:lang w:val="en-US" w:bidi="ar-SA"/>
+      <w:lang w:bidi="ar-SA"/>
       <w14:ligatures w14:val="standardContextual"/>
     </w:rPr>
   </w:style>
@@ -1885,7 +4892,7 @@
       <w:rFonts w:asciiTheme="minorHAnsi" w:hAnsiTheme="minorHAnsi" w:cstheme="minorBidi"/>
       <w:kern w:val="2"/>
       <w:szCs w:val="24"/>
-      <w:lang w:val="en-US" w:bidi="ar-SA"/>
+      <w:lang w:bidi="ar-SA"/>
       <w14:ligatures w14:val="standardContextual"/>
     </w:rPr>
   </w:style>
@@ -1925,7 +4932,7 @@
       <w:color w:val="0F4761" w:themeColor="accent1" w:themeShade="BF"/>
       <w:kern w:val="2"/>
       <w:szCs w:val="24"/>
-      <w:lang w:val="en-US" w:bidi="ar-SA"/>
+      <w:lang w:bidi="ar-SA"/>
       <w14:ligatures w14:val="standardContextual"/>
     </w:rPr>
   </w:style>

</xml_diff>